<commit_message>
running the comparsion of local models on gpu pc
</commit_message>
<xml_diff>
--- a/Assignment3_Report_final_version.docx
+++ b/Assignment3_Report_final_version.docx
@@ -13,6 +13,13 @@
         </w:rPr>
         <w:t>Assignment 3: Agents — doit Shell Agent</w:t>
       </w:r>
+      <w:r>
+        <w:rPr>
+          <w:b/>
+          <w:sz w:val="40"/>
+        </w:rPr>
+        <w:t xml:space="preserve"> by Nadav Banay (326277910)</w:t>
+      </w:r>
     </w:p>
     <w:p>
       <w:pPr>
@@ -41,11 +48,9 @@
       <w:r>
         <w:t xml:space="preserve">anguage requests, calls an LLM to produce a structured </w:t>
       </w:r>
-      <w:proofErr w:type="spellStart"/>
       <w:r>
         <w:t>json</w:t>
       </w:r>
-      <w:proofErr w:type="spellEnd"/>
       <w:r>
         <w:t xml:space="preserve"> response</w:t>
       </w:r>
@@ -64,59 +69,19 @@
     </w:p>
     <w:p>
       <w:r>
-        <w:t>3 model configurations are supported with ~/</w:t>
-      </w:r>
-      <w:proofErr w:type="spellStart"/>
-      <w:r>
-        <w:t>doit.cfg</w:t>
-      </w:r>
-      <w:proofErr w:type="spellEnd"/>
-      <w:r>
-        <w:t xml:space="preserve">: a hosted </w:t>
-      </w:r>
-      <w:proofErr w:type="spellStart"/>
-      <w:r>
-        <w:t>api</w:t>
-      </w:r>
-      <w:proofErr w:type="spellEnd"/>
-      <w:r>
-        <w:t xml:space="preserve"> model (</w:t>
-      </w:r>
-      <w:proofErr w:type="spellStart"/>
-      <w:r>
-        <w:t>Groq</w:t>
-      </w:r>
-      <w:proofErr w:type="spellEnd"/>
-      <w:r>
-        <w:t xml:space="preserve"> / llama-3.1-8b-instant), a local instruction model without tool</w:t>
+        <w:t>3 model configurations are supported with ~/doit.cfg: a hosted api model (Groq / llama-3.1-8b-instant), a local instruction model without tool</w:t>
       </w:r>
       <w:r>
         <w:t xml:space="preserve"> </w:t>
       </w:r>
       <w:r>
-        <w:t>calling (</w:t>
-      </w:r>
-      <w:proofErr w:type="spellStart"/>
-      <w:r>
-        <w:t>ollama</w:t>
-      </w:r>
-      <w:proofErr w:type="spellEnd"/>
-      <w:r>
-        <w:t>/gemma3:4b), and a local tool</w:t>
+        <w:t>calling (ollama/gemma3:4b), and a local tool</w:t>
       </w:r>
       <w:r>
         <w:t xml:space="preserve"> </w:t>
       </w:r>
       <w:r>
-        <w:t>calling model (</w:t>
-      </w:r>
-      <w:proofErr w:type="spellStart"/>
-      <w:r>
-        <w:t>ollama</w:t>
-      </w:r>
-      <w:proofErr w:type="spellEnd"/>
-      <w:r>
-        <w:t>/qwen3:4b).</w:t>
+        <w:t>calling model (ollama/qwen3:4b).</w:t>
       </w:r>
     </w:p>
     <w:p>
@@ -137,43 +102,17 @@
     </w:p>
     <w:p>
       <w:r>
-        <w:t>_</w:t>
-      </w:r>
-      <w:proofErr w:type="spellStart"/>
-      <w:r>
-        <w:t>build_messages</w:t>
-      </w:r>
-      <w:proofErr w:type="spellEnd"/>
-      <w:r>
-        <w:t xml:space="preserve">() </w:t>
+        <w:t xml:space="preserve">_build_messages() </w:t>
       </w:r>
       <w:r>
         <w:t>creates</w:t>
       </w:r>
       <w:r>
-        <w:t xml:space="preserve"> the message list. _</w:t>
-      </w:r>
-      <w:proofErr w:type="spellStart"/>
-      <w:r>
-        <w:t>call_llm</w:t>
-      </w:r>
-      <w:proofErr w:type="spellEnd"/>
-      <w:r>
-        <w:t xml:space="preserve">() calls </w:t>
-      </w:r>
-      <w:proofErr w:type="spellStart"/>
-      <w:r>
-        <w:t>LiteLLM</w:t>
-      </w:r>
-      <w:proofErr w:type="spellEnd"/>
-      <w:r>
-        <w:t xml:space="preserve"> and parses the </w:t>
-      </w:r>
-      <w:proofErr w:type="spellStart"/>
+        <w:t xml:space="preserve"> the message list. _call_llm() calls LiteLLM and parses the </w:t>
+      </w:r>
       <w:r>
         <w:t>json</w:t>
       </w:r>
-      <w:proofErr w:type="spellEnd"/>
       <w:r>
         <w:t xml:space="preserve"> response (with a markdown</w:t>
       </w:r>
@@ -187,15 +126,7 @@
         <w:t xml:space="preserve"> </w:t>
       </w:r>
       <w:r>
-        <w:t>stripping step and a regex fallback for models that add extra prose). _</w:t>
-      </w:r>
-      <w:proofErr w:type="spellStart"/>
-      <w:r>
-        <w:t>process_response</w:t>
-      </w:r>
-      <w:proofErr w:type="spellEnd"/>
-      <w:r>
-        <w:t xml:space="preserve">() dispatches on </w:t>
+        <w:t xml:space="preserve">stripping step and a regex fallback for models that add extra prose). _process_response() dispatches on </w:t>
       </w:r>
       <w:proofErr w:type="gramStart"/>
       <w:r>
@@ -268,11 +199,9 @@
       <w:r>
         <w:t xml:space="preserve">clarification — </w:t>
       </w:r>
-      <w:proofErr w:type="spellStart"/>
       <w:r>
         <w:t>llm</w:t>
       </w:r>
-      <w:proofErr w:type="spellEnd"/>
       <w:r>
         <w:t xml:space="preserve"> needs more information</w:t>
       </w:r>
@@ -286,13 +215,8 @@
         </w:numPr>
         <w:ind w:left="360"/>
       </w:pPr>
-      <w:proofErr w:type="spellStart"/>
-      <w:r>
-        <w:t>multi_step</w:t>
-      </w:r>
-      <w:proofErr w:type="spellEnd"/>
-      <w:r>
-        <w:t xml:space="preserve"> — ordered sequence of commands</w:t>
+      <w:r>
+        <w:t>multi_step — ordered sequence of commands</w:t>
       </w:r>
     </w:p>
     <w:p>
@@ -304,11 +228,9 @@
       </w:r>
     </w:p>
     <w:p>
-      <w:proofErr w:type="spellStart"/>
       <w:r>
         <w:t>json</w:t>
       </w:r>
-      <w:proofErr w:type="spellEnd"/>
       <w:r>
         <w:t xml:space="preserve"> </w:t>
       </w:r>
@@ -337,23 +259,7 @@
         <w:t xml:space="preserve"> </w:t>
       </w:r>
       <w:r>
-        <w:t xml:space="preserve">command classification is embedded in the same </w:t>
-      </w:r>
-      <w:proofErr w:type="spellStart"/>
-      <w:r>
-        <w:t>json</w:t>
-      </w:r>
-      <w:proofErr w:type="spellEnd"/>
-      <w:r>
-        <w:t xml:space="preserve"> response (the "dangerous" </w:t>
-      </w:r>
-      <w:proofErr w:type="spellStart"/>
-      <w:r>
-        <w:t>boolean</w:t>
-      </w:r>
-      <w:proofErr w:type="spellEnd"/>
-      <w:r>
-        <w:t xml:space="preserve"> field), avoiding an extra LLM call.</w:t>
+        <w:t>command classification is embedded in the same json response (the "dangerous" boolean field), avoiding an extra LLM call.</w:t>
       </w:r>
     </w:p>
     <w:p>
@@ -529,7 +435,6 @@
         </w:rPr>
         <w:t xml:space="preserve">"impossible" is triggered only by the </w:t>
       </w:r>
-      <w:proofErr w:type="spellStart"/>
       <w:r>
         <w:rPr>
           <w:bCs/>
@@ -537,7 +442,6 @@
         </w:rPr>
         <w:t>llm's</w:t>
       </w:r>
-      <w:proofErr w:type="spellEnd"/>
       <w:r>
         <w:rPr>
           <w:bCs/>
@@ -587,29 +491,11 @@
       <w:r>
         <w:t xml:space="preserve">commands). The </w:t>
       </w:r>
-      <w:proofErr w:type="spellStart"/>
       <w:r>
         <w:t>llm</w:t>
       </w:r>
-      <w:proofErr w:type="spellEnd"/>
-      <w:r>
-        <w:t xml:space="preserve"> sets the "dangerous" </w:t>
-      </w:r>
-      <w:proofErr w:type="spellStart"/>
-      <w:r>
-        <w:t>boolean</w:t>
-      </w:r>
-      <w:proofErr w:type="spellEnd"/>
-      <w:r>
-        <w:t xml:space="preserve"> in the same response — no extra LLM call. When dangerous=true, </w:t>
-      </w:r>
-      <w:proofErr w:type="spellStart"/>
-      <w:r>
-        <w:t>handle_command</w:t>
-      </w:r>
-      <w:proofErr w:type="spellEnd"/>
-      <w:r>
-        <w:t>() prints a warning and prompts y/N before executing.</w:t>
+      <w:r>
+        <w:t xml:space="preserve"> sets the "dangerous" boolean in the same response — no extra LLM call. When dangerous=true, handle_command() prints a warning and prompts y/N before executing.</w:t>
       </w:r>
     </w:p>
     <w:p>
@@ -622,23 +508,7 @@
     </w:p>
     <w:p>
       <w:r>
-        <w:t xml:space="preserve">Keeping the classification in the same call avoids disagreement between 2 separate calls. The prompt lists concrete examples to help the </w:t>
-      </w:r>
-      <w:proofErr w:type="spellStart"/>
-      <w:r>
-        <w:t>llm</w:t>
-      </w:r>
-      <w:proofErr w:type="spellEnd"/>
-      <w:r>
-        <w:t xml:space="preserve"> </w:t>
-      </w:r>
-      <w:proofErr w:type="spellStart"/>
-      <w:r>
-        <w:t>generalise</w:t>
-      </w:r>
-      <w:proofErr w:type="spellEnd"/>
-      <w:r>
-        <w:t xml:space="preserve"> to other dangerous cases.</w:t>
+        <w:t>Keeping the classification in the same call avoids disagreement between 2 separate calls. The prompt lists concrete examples to help the llm generalise to other dangerous cases.</w:t>
       </w:r>
     </w:p>
     <w:p>
@@ -760,23 +630,7 @@
           <w:b/>
           <w:color w:val="005FAF"/>
         </w:rPr>
-        <w:t xml:space="preserve">Limitation found during testing: </w:t>
-      </w:r>
-      <w:proofErr w:type="spellStart"/>
-      <w:r>
-        <w:rPr>
-          <w:b/>
-          <w:color w:val="005FAF"/>
-        </w:rPr>
-        <w:t>mkdir</w:t>
-      </w:r>
-      <w:proofErr w:type="spellEnd"/>
-      <w:r>
-        <w:rPr>
-          <w:b/>
-          <w:color w:val="005FAF"/>
-        </w:rPr>
-        <w:t xml:space="preserve"> classified as dangerous=false</w:t>
+        <w:t>Limitation found during testing: mkdir classified as dangerous=false</w:t>
       </w:r>
     </w:p>
     <w:p>
@@ -789,23 +643,7 @@
           <w:rFonts w:ascii="Courier New" w:hAnsi="Courier New"/>
           <w:sz w:val="18"/>
         </w:rPr>
-        <w:t xml:space="preserve">$ doit "create a folder called </w:t>
-      </w:r>
-      <w:proofErr w:type="spellStart"/>
-      <w:r>
-        <w:rPr>
-          <w:rFonts w:ascii="Courier New" w:hAnsi="Courier New"/>
-          <w:sz w:val="18"/>
-        </w:rPr>
-        <w:t>doit_test</w:t>
-      </w:r>
-      <w:proofErr w:type="spellEnd"/>
-      <w:r>
-        <w:rPr>
-          <w:rFonts w:ascii="Courier New" w:hAnsi="Courier New"/>
-          <w:sz w:val="18"/>
-        </w:rPr>
-        <w:t>"</w:t>
+        <w:t>$ doit "create a folder called doit_test"</w:t>
       </w:r>
     </w:p>
     <w:p>
@@ -831,23 +669,7 @@
           <w:rFonts w:ascii="Courier New" w:hAnsi="Courier New"/>
           <w:sz w:val="18"/>
         </w:rPr>
-        <w:t xml:space="preserve"># </w:t>
-      </w:r>
-      <w:proofErr w:type="spellStart"/>
-      <w:r>
-        <w:rPr>
-          <w:rFonts w:ascii="Courier New" w:hAnsi="Courier New"/>
-          <w:sz w:val="18"/>
-        </w:rPr>
-        <w:t>mkdir</w:t>
-      </w:r>
-      <w:proofErr w:type="spellEnd"/>
-      <w:r>
-        <w:rPr>
-          <w:rFonts w:ascii="Courier New" w:hAnsi="Courier New"/>
-          <w:sz w:val="18"/>
-        </w:rPr>
-        <w:t xml:space="preserve"> ran immediately without confirmation.</w:t>
+        <w:t># mkdir ran immediately without confirmation.</w:t>
       </w:r>
     </w:p>
     <w:p>
@@ -860,39 +682,7 @@
           <w:rFonts w:ascii="Courier New" w:hAnsi="Courier New"/>
           <w:sz w:val="18"/>
         </w:rPr>
-        <w:t xml:space="preserve"># The system prompt lists </w:t>
-      </w:r>
-      <w:proofErr w:type="spellStart"/>
-      <w:r>
-        <w:rPr>
-          <w:rFonts w:ascii="Courier New" w:hAnsi="Courier New"/>
-          <w:sz w:val="18"/>
-        </w:rPr>
-        <w:t>rmdir</w:t>
-      </w:r>
-      <w:proofErr w:type="spellEnd"/>
-      <w:r>
-        <w:rPr>
-          <w:rFonts w:ascii="Courier New" w:hAnsi="Courier New"/>
-          <w:sz w:val="18"/>
-        </w:rPr>
-        <w:t xml:space="preserve"> but not </w:t>
-      </w:r>
-      <w:proofErr w:type="spellStart"/>
-      <w:r>
-        <w:rPr>
-          <w:rFonts w:ascii="Courier New" w:hAnsi="Courier New"/>
-          <w:sz w:val="18"/>
-        </w:rPr>
-        <w:t>mkdir</w:t>
-      </w:r>
-      <w:proofErr w:type="spellEnd"/>
-      <w:r>
-        <w:rPr>
-          <w:rFonts w:ascii="Courier New" w:hAnsi="Courier New"/>
-          <w:sz w:val="18"/>
-        </w:rPr>
-        <w:t xml:space="preserve"> explicitly;</w:t>
+        <w:t># The system prompt lists rmdir but not mkdir explicitly;</w:t>
       </w:r>
     </w:p>
     <w:p>
@@ -923,1001 +713,788 @@
           <w:color w:val="000000" w:themeColor="text1"/>
         </w:rPr>
       </w:pPr>
-      <w:proofErr w:type="spellStart"/>
       <w:r>
         <w:rPr>
           <w:bCs/>
           <w:color w:val="000000" w:themeColor="text1"/>
         </w:rPr>
-        <w:t>mkdir</w:t>
-      </w:r>
-      <w:proofErr w:type="spellEnd"/>
+        <w:t xml:space="preserve">mkdir, touch, and </w:t>
+      </w:r>
       <w:r>
         <w:rPr>
           <w:bCs/>
           <w:color w:val="000000" w:themeColor="text1"/>
         </w:rPr>
-        <w:t xml:space="preserve">, touch, and </w:t>
+        <w:t>other</w:t>
       </w:r>
       <w:r>
         <w:rPr>
           <w:bCs/>
           <w:color w:val="000000" w:themeColor="text1"/>
         </w:rPr>
-        <w:t>other</w:t>
+        <w:t xml:space="preserve"> commands are sometimes misclassified as safe. The system prompt lists rmdir but not mkdir — the </w:t>
       </w:r>
       <w:r>
         <w:rPr>
           <w:bCs/>
           <w:color w:val="000000" w:themeColor="text1"/>
         </w:rPr>
-        <w:t xml:space="preserve"> commands are sometimes misclassified as safe. The system prompt lists </w:t>
-      </w:r>
-      <w:proofErr w:type="spellStart"/>
+        <w:t>llm</w:t>
+      </w:r>
       <w:r>
         <w:rPr>
           <w:bCs/>
           <w:color w:val="000000" w:themeColor="text1"/>
         </w:rPr>
-        <w:t>rmdir</w:t>
-      </w:r>
-      <w:proofErr w:type="spellEnd"/>
+        <w:t xml:space="preserve"> does not always generalise </w:t>
+      </w:r>
       <w:r>
         <w:rPr>
           <w:bCs/>
           <w:color w:val="000000" w:themeColor="text1"/>
         </w:rPr>
-        <w:t xml:space="preserve"> but not </w:t>
-      </w:r>
-      <w:proofErr w:type="spellStart"/>
-      <w:r>
-        <w:rPr>
-          <w:bCs/>
-          <w:color w:val="000000" w:themeColor="text1"/>
-        </w:rPr>
-        <w:t>mkdir</w:t>
-      </w:r>
-      <w:proofErr w:type="spellEnd"/>
-      <w:r>
-        <w:rPr>
-          <w:bCs/>
-          <w:color w:val="000000" w:themeColor="text1"/>
-        </w:rPr>
-        <w:t xml:space="preserve"> — the </w:t>
-      </w:r>
-      <w:proofErr w:type="spellStart"/>
-      <w:r>
-        <w:rPr>
-          <w:bCs/>
-          <w:color w:val="000000" w:themeColor="text1"/>
-        </w:rPr>
+        <w:t>the dangerous scenarios.</w:t>
+      </w:r>
+    </w:p>
+    <w:p/>
+    <w:p>
+      <w:pPr>
+        <w:pStyle w:val="Heading1"/>
+      </w:pPr>
+      <w:r>
+        <w:t>Section 3: Model Flexibility</w:t>
+      </w:r>
+    </w:p>
+    <w:p>
+      <w:pPr>
+        <w:pStyle w:val="Heading2"/>
+      </w:pPr>
+      <w:r>
+        <w:t>What was implemented</w:t>
+      </w:r>
+    </w:p>
+    <w:p>
+      <w:r>
+        <w:t>~/doit.cfg selects the model and provider. _call_llm() passes the config directly to LiteLLM's completion</w:t>
+      </w:r>
+      <w:proofErr w:type="gramStart"/>
+      <w:r>
+        <w:t>() —</w:t>
+      </w:r>
+      <w:proofErr w:type="gramEnd"/>
+      <w:r>
+        <w:t xml:space="preserve"> no provider-specific code exists in doit. Three configurations were tested:</w:t>
+      </w:r>
+    </w:p>
+    <w:p>
+      <w:pPr>
+        <w:pStyle w:val="ListBullet"/>
+      </w:pPr>
+      <w:r>
+        <w:t>API: groq/llama-3.1-8b-instant</w:t>
+      </w:r>
+    </w:p>
+    <w:p>
+      <w:pPr>
+        <w:pStyle w:val="ListBullet"/>
+      </w:pPr>
+      <w:r>
+        <w:t>local_tools: ollama/qwen3:4b</w:t>
+      </w:r>
+    </w:p>
+    <w:p>
+      <w:pPr>
+        <w:pStyle w:val="ListBullet"/>
+      </w:pPr>
+      <w:r>
+        <w:t>local_no_tools: ollama/gemma3:4b</w:t>
+      </w:r>
+    </w:p>
+    <w:p>
+      <w:pPr>
+        <w:pStyle w:val="Heading2"/>
+      </w:pPr>
+      <w:r>
+        <w:t>doit.cfg examples</w:t>
+      </w:r>
+    </w:p>
+    <w:p>
+      <w:pPr>
+        <w:shd w:val="clear" w:color="auto" w:fill="F2F2F2"/>
+      </w:pPr>
+      <w:r>
+        <w:rPr>
+          <w:rFonts w:ascii="Courier New" w:hAnsi="Courier New"/>
+          <w:sz w:val="18"/>
+        </w:rPr>
+        <w:t>{"model":"groq/llama-3.1-8b-instant","api_key":"gsk_...","api_base</w:t>
+      </w:r>
+      <w:proofErr w:type="gramStart"/>
+      <w:r>
+        <w:rPr>
+          <w:rFonts w:ascii="Courier New" w:hAnsi="Courier New"/>
+          <w:sz w:val="18"/>
+        </w:rPr>
+        <w:t>":"","</w:t>
+      </w:r>
+      <w:proofErr w:type="gramEnd"/>
+      <w:r>
+        <w:rPr>
+          <w:rFonts w:ascii="Courier New" w:hAnsi="Courier New"/>
+          <w:sz w:val="18"/>
+        </w:rPr>
+        <w:t>model_type":"</w:t>
+      </w:r>
+      <w:proofErr w:type="gramStart"/>
+      <w:r>
+        <w:rPr>
+          <w:rFonts w:ascii="Courier New" w:hAnsi="Courier New"/>
+          <w:sz w:val="18"/>
+        </w:rPr>
+        <w:t>api"}</w:t>
+      </w:r>
+      <w:proofErr w:type="gramEnd"/>
+    </w:p>
+    <w:p>
+      <w:pPr>
+        <w:shd w:val="clear" w:color="auto" w:fill="F2F2F2"/>
+      </w:pPr>
+      <w:r>
+        <w:rPr>
+          <w:rFonts w:ascii="Courier New" w:hAnsi="Courier New"/>
+          <w:sz w:val="18"/>
+        </w:rPr>
+        <w:t>{"model":"ollama/qwen3:4b","api_key":"","api_base":"</w:t>
+      </w:r>
+      <w:proofErr w:type="gramStart"/>
+      <w:r>
+        <w:rPr>
+          <w:rFonts w:ascii="Courier New" w:hAnsi="Courier New"/>
+          <w:sz w:val="18"/>
+        </w:rPr>
+        <w:t>http://localhost:11434","model_type":"local_tools"}</w:t>
+      </w:r>
+      <w:proofErr w:type="gramEnd"/>
+    </w:p>
+    <w:p>
+      <w:pPr>
+        <w:shd w:val="clear" w:color="auto" w:fill="F2F2F2"/>
+      </w:pPr>
+      <w:r>
+        <w:rPr>
+          <w:rFonts w:ascii="Courier New" w:hAnsi="Courier New"/>
+          <w:sz w:val="18"/>
+        </w:rPr>
+        <w:t>{"model":"ollama/gemma3:4b","api_key":"","api_base":"</w:t>
+      </w:r>
+      <w:proofErr w:type="gramStart"/>
+      <w:r>
+        <w:rPr>
+          <w:rFonts w:ascii="Courier New" w:hAnsi="Courier New"/>
+          <w:sz w:val="18"/>
+        </w:rPr>
+        <w:t>http://localhost:11434","model_type":"local_no_tools"}</w:t>
+      </w:r>
+      <w:proofErr w:type="gramEnd"/>
+    </w:p>
+    <w:p>
+      <w:pPr>
+        <w:pStyle w:val="Heading2"/>
+      </w:pPr>
+      <w:r>
+        <w:t>Model comparison — same request, all three models</w:t>
+      </w:r>
+    </w:p>
+    <w:p>
+      <w:pPr>
+        <w:pStyle w:val="Heading3"/>
+      </w:pPr>
+      <w:r>
+        <w:t>Test 1: Basic read-</w:t>
+      </w:r>
+      <w:proofErr w:type="gramStart"/>
+      <w:r>
+        <w:t>only — "</w:t>
+      </w:r>
+      <w:proofErr w:type="gramEnd"/>
+      <w:r>
+        <w:t>list all python files in this directory"</w:t>
+      </w:r>
+    </w:p>
+    <w:p>
+      <w:r>
+        <w:t>All three models: direct_json, correct command, dangerous=false.</w:t>
+      </w:r>
+    </w:p>
+    <w:p>
+      <w:pPr>
+        <w:shd w:val="clear" w:color="auto" w:fill="F2F2F2"/>
+      </w:pPr>
+      <w:r>
+        <w:rPr>
+          <w:rFonts w:ascii="Courier New" w:hAnsi="Courier New"/>
+          <w:sz w:val="18"/>
+        </w:rPr>
+        <w:t>groq:   ls *.py  [direct_json]</w:t>
+      </w:r>
+      <w:r>
+        <w:rPr>
+          <w:rFonts w:ascii="Courier New" w:hAnsi="Courier New"/>
+          <w:sz w:val="18"/>
+        </w:rPr>
+        <w:br/>
+        <w:t>qwen3:  ls *.py  [direct_json]</w:t>
+      </w:r>
+      <w:r>
+        <w:rPr>
+          <w:rFonts w:ascii="Courier New" w:hAnsi="Courier New"/>
+          <w:sz w:val="18"/>
+        </w:rPr>
+        <w:br/>
+        <w:t>gemma3: ls *.py  [direct_json — markdown fences stripped by regex]</w:t>
+      </w:r>
+    </w:p>
+    <w:p>
+      <w:r>
+        <w:t>gemma3 wrapped output with "json..." fences despite the instruction not to. The fence-stripping regex recovered it cleanly. On simple requests all three models behave correctly.</w:t>
+      </w:r>
+    </w:p>
+    <w:p>
+      <w:pPr>
+        <w:pStyle w:val="Heading3"/>
+      </w:pPr>
+      <w:r>
+        <w:lastRenderedPageBreak/>
+        <w:t>Test 2: Complex multi-</w:t>
+      </w:r>
+      <w:proofErr w:type="gramStart"/>
+      <w:r>
+        <w:t>step — "</w:t>
+      </w:r>
+      <w:proofErr w:type="gramEnd"/>
+      <w:r>
+        <w:t>find all files modified in the last 24 hours and move them to a backup folder"</w:t>
+      </w:r>
+    </w:p>
+    <w:p>
+      <w:r>
+        <w:t>groq/llama-3.1-8b-instant  →  fallback_answer (invalid JSON escape)</w:t>
+      </w:r>
+    </w:p>
+    <w:p>
+      <w:pPr>
+        <w:shd w:val="clear" w:color="auto" w:fill="F2F2F2"/>
+      </w:pPr>
+      <w:r>
+        <w:rPr>
+          <w:rFonts w:ascii="Courier New" w:hAnsi="Courier New"/>
+          <w:sz w:val="18"/>
+        </w:rPr>
+        <w:t xml:space="preserve">{"type":"command","command":"find . -type f -mtime -1 -exec </w:t>
+      </w:r>
+      <w:proofErr w:type="gramStart"/>
+      <w:r>
+        <w:rPr>
+          <w:rFonts w:ascii="Courier New" w:hAnsi="Courier New"/>
+          <w:sz w:val="18"/>
+        </w:rPr>
+        <w:t>mv {} /</w:t>
+      </w:r>
+      <w:proofErr w:type="gramEnd"/>
+      <w:r>
+        <w:rPr>
+          <w:rFonts w:ascii="Courier New" w:hAnsi="Courier New"/>
+          <w:sz w:val="18"/>
+        </w:rPr>
+        <w:t>backup/ \;", ...,"dangerous":true}</w:t>
+      </w:r>
+    </w:p>
+    <w:p>
+      <w:r>
+        <w:t>The command contains \; which is invalid JSON (backslash must be escaped as \\). json.loads() failed and the regex fallback also failed, so the response was silently demoted to type=answer — the command was never executed.</w:t>
+      </w:r>
+    </w:p>
+    <w:p>
+      <w:r>
+        <w:t>ollama/qwen3:4b  →  clarification (direct_json)</w:t>
+      </w:r>
+    </w:p>
+    <w:p>
+      <w:pPr>
+        <w:shd w:val="clear" w:color="auto" w:fill="F2F2F2"/>
+      </w:pPr>
+      <w:r>
+        <w:rPr>
+          <w:rFonts w:ascii="Courier New" w:hAnsi="Courier New"/>
+          <w:sz w:val="18"/>
+        </w:rPr>
+        <w:t>{"type":"clarification","question":"Which backup folder should I use?",</w:t>
+      </w:r>
+      <w:r>
+        <w:rPr>
+          <w:rFonts w:ascii="Courier New" w:hAnsi="Courier New"/>
+          <w:sz w:val="18"/>
+        </w:rPr>
+        <w:br/>
+        <w:t xml:space="preserve"> "options":["/backup","~/backup","custom</w:t>
+      </w:r>
+      <w:proofErr w:type="gramStart"/>
+      <w:r>
+        <w:rPr>
+          <w:rFonts w:ascii="Courier New" w:hAnsi="Courier New"/>
+          <w:sz w:val="18"/>
+        </w:rPr>
+        <w:t>"]}</w:t>
+      </w:r>
+      <w:proofErr w:type="gramEnd"/>
+    </w:p>
+    <w:p>
+      <w:r>
+        <w:t>qwen3 recognised the destination was unspecified and asked before acting — the most correct response.</w:t>
+      </w:r>
+    </w:p>
+    <w:p>
+      <w:r>
+        <w:t>ollama/gemma3:4b  →  fallback_answer (malformed JSON)</w:t>
+      </w:r>
+    </w:p>
+    <w:p>
+      <w:pPr>
+        <w:shd w:val="clear" w:color="auto" w:fill="F2F2F2"/>
+      </w:pPr>
+      <w:r>
+        <w:rPr>
+          <w:rFonts w:ascii="Courier New" w:hAnsi="Courier New"/>
+          <w:sz w:val="18"/>
+        </w:rPr>
+        <w:t>{"type":"multi_step","steps":[</w:t>
+      </w:r>
+      <w:r>
+        <w:rPr>
+          <w:rFonts w:ascii="Courier New" w:hAnsi="Courier New"/>
+          <w:sz w:val="18"/>
+        </w:rPr>
+        <w:br/>
+        <w:t xml:space="preserve">  {"command":"find / -type f -mtime -1 -print0", ...},</w:t>
+      </w:r>
+      <w:r>
+        <w:rPr>
+          <w:rFonts w:ascii="Courier New" w:hAnsi="Courier New"/>
+          <w:sz w:val="18"/>
+        </w:rPr>
+        <w:br/>
+        <w:t xml:space="preserve">  {"command":"mkdir -p /path/to/backup", ...},</w:t>
+      </w:r>
+      <w:r>
+        <w:rPr>
+          <w:rFonts w:ascii="Courier New" w:hAnsi="Courier New"/>
+          <w:sz w:val="18"/>
+        </w:rPr>
+        <w:br/>
+        <w:t xml:space="preserve">  {"command":"xargs -0 mv </w:t>
+      </w:r>
+      <w:proofErr w:type="gramStart"/>
+      <w:r>
+        <w:rPr>
+          <w:rFonts w:ascii="Courier New" w:hAnsi="Courier New"/>
+          <w:sz w:val="18"/>
+        </w:rPr>
+        <w:t>-- {}",</w:t>
+      </w:r>
+      <w:proofErr w:type="gramEnd"/>
+      <w:r>
+        <w:rPr>
+          <w:rFonts w:ascii="Courier New" w:hAnsi="Courier New"/>
+          <w:sz w:val="18"/>
+        </w:rPr>
+        <w:t>description":"</w:t>
+      </w:r>
+      <w:proofErr w:type="gramStart"/>
+      <w:r>
+        <w:rPr>
+          <w:rFonts w:ascii="Courier New" w:hAnsi="Courier New"/>
+          <w:sz w:val="18"/>
+        </w:rPr>
+        <w:t xml:space="preserve">..."}  </w:t>
+      </w:r>
+      <w:proofErr w:type="gramEnd"/>
+      <w:r>
+        <w:rPr>
+          <w:rFonts w:ascii="Courier New" w:hAnsi="Courier New"/>
+          <w:sz w:val="18"/>
+        </w:rPr>
+        <w:t xml:space="preserve"> &lt;-- missing opening quote</w:t>
+      </w:r>
+      <w:r>
+        <w:rPr>
+          <w:rFonts w:ascii="Courier New" w:hAnsi="Courier New"/>
+          <w:sz w:val="18"/>
+        </w:rPr>
+        <w:br/>
+        <w:t>]}</w:t>
+      </w:r>
+    </w:p>
+    <w:p>
+      <w:r>
+        <w:t>gemma3 attempted the right structure (multi_step with 3 steps) but the JSON was malformed — a missing quote on the third step's key. Both json.loads() and the regex fallback failed, so the entire plan was silently discarded. gemma3 also searched from / instead of ., which would scan the entire filesystem.</w:t>
+      </w:r>
+    </w:p>
+    <w:p>
+      <w:pPr>
+        <w:pStyle w:val="Heading3"/>
+      </w:pPr>
+      <w:r>
+        <w:t xml:space="preserve">Test 3: Ambiguous </w:t>
+      </w:r>
+      <w:proofErr w:type="gramStart"/>
+      <w:r>
+        <w:t>request — "</w:t>
+      </w:r>
+      <w:proofErr w:type="gramEnd"/>
+      <w:r>
+        <w:t>move the files"</w:t>
+      </w:r>
+    </w:p>
+    <w:p>
+      <w:r>
+        <w:t>groq/llama-3.1-8b-instant  -&gt;  command with placeholder paths (direct_json, dangerous=true)</w:t>
+      </w:r>
+    </w:p>
+    <w:p>
+      <w:pPr>
+        <w:shd w:val="clear" w:color="auto" w:fill="F2F2F2"/>
+      </w:pPr>
+      <w:r>
+        <w:rPr>
+          <w:rFonts w:ascii="Courier New" w:hAnsi="Courier New"/>
+          <w:sz w:val="18"/>
+        </w:rPr>
+        <w:t>{"type":"command","command":"mv /path/to/source /path/to/destination","dangerous":true}</w:t>
+      </w:r>
+    </w:p>
+    <w:p>
+      <w:r>
+        <w:t xml:space="preserve">Didn't </w:t>
+      </w:r>
+      <w:proofErr w:type="gramStart"/>
+      <w:r>
+        <w:t>clarify, but</w:t>
+      </w:r>
+      <w:proofErr w:type="gramEnd"/>
+      <w:r>
+        <w:t xml:space="preserve"> used placeholder paths and correctly flagged dangerous=true.</w:t>
+      </w:r>
+    </w:p>
+    <w:p>
+      <w:r>
+        <w:t>ollama/qwen3:4b  →  clarification (direct_json)</w:t>
+      </w:r>
+    </w:p>
+    <w:p>
+      <w:pPr>
+        <w:shd w:val="clear" w:color="auto" w:fill="F2F2F2"/>
+      </w:pPr>
+      <w:r>
+        <w:rPr>
+          <w:rFonts w:ascii="Courier New" w:hAnsi="Courier New"/>
+          <w:sz w:val="18"/>
+        </w:rPr>
+        <w:t>{"type":"clarification","question":"Which files do you want to move?",</w:t>
+      </w:r>
+      <w:r>
+        <w:rPr>
+          <w:rFonts w:ascii="Courier New" w:hAnsi="Courier New"/>
+          <w:sz w:val="18"/>
+        </w:rPr>
+        <w:br/>
+        <w:t xml:space="preserve"> "options":["all files in current directory","specific files</w:t>
+      </w:r>
+      <w:proofErr w:type="gramStart"/>
+      <w:r>
+        <w:rPr>
+          <w:rFonts w:ascii="Courier New" w:hAnsi="Courier New"/>
+          <w:sz w:val="18"/>
+        </w:rPr>
+        <w:t>"]}</w:t>
+      </w:r>
+      <w:proofErr w:type="gramEnd"/>
+    </w:p>
+    <w:p>
+      <w:r>
+        <w:t>Correct action, asked before acting.</w:t>
+      </w:r>
+    </w:p>
+    <w:p>
+      <w:r>
+        <w:t>ollama/gemma3:4b  →  no-op command (direct_json, dangerous=false)</w:t>
+      </w:r>
+    </w:p>
+    <w:p>
+      <w:pPr>
+        <w:shd w:val="clear" w:color="auto" w:fill="F2F2F2"/>
+      </w:pPr>
+      <w:r>
+        <w:rPr>
+          <w:rFonts w:ascii="Courier New" w:hAnsi="Courier New"/>
+          <w:sz w:val="18"/>
+        </w:rPr>
+        <w:lastRenderedPageBreak/>
+        <w:t>{"type":"command","command":"</w:t>
+      </w:r>
+      <w:proofErr w:type="gramStart"/>
+      <w:r>
+        <w:rPr>
+          <w:rFonts w:ascii="Courier New" w:hAnsi="Courier New"/>
+          <w:sz w:val="18"/>
+        </w:rPr>
+        <w:t>mv * ."</w:t>
+      </w:r>
+      <w:proofErr w:type="gramEnd"/>
+      <w:r>
+        <w:rPr>
+          <w:rFonts w:ascii="Courier New" w:hAnsi="Courier New"/>
+          <w:sz w:val="18"/>
+        </w:rPr>
+        <w:t>,"description":"Moves all files to the same location (effectively doing nothing).","dangerous":false}</w:t>
+      </w:r>
+    </w:p>
+    <w:p>
+      <w:r>
+        <w:t>Two failures: mv is listed as dangerous in the system prompt but was flagged false; and the model "resolved" the ambiguity by generating a no-op rather than asking. type=clarification appears to be outside gemma3's output distribution.</w:t>
+      </w:r>
+    </w:p>
+    <w:p>
+      <w:pPr>
+        <w:pStyle w:val="Heading3"/>
+      </w:pPr>
+      <w:r>
+        <w:t xml:space="preserve">Test 4: Dangerous </w:t>
+      </w:r>
+      <w:proofErr w:type="gramStart"/>
+      <w:r>
+        <w:t>classification — "</w:t>
+      </w:r>
+      <w:proofErr w:type="gramEnd"/>
+      <w:r>
+        <w:t>clean up temp files in /tmp"</w:t>
+      </w:r>
+    </w:p>
+    <w:p>
+      <w:r>
+        <w:t>All three correctly set dangerous=true:</w:t>
+      </w:r>
+    </w:p>
+    <w:p>
+      <w:pPr>
+        <w:shd w:val="clear" w:color="auto" w:fill="F2F2F2"/>
+      </w:pPr>
+      <w:r>
+        <w:rPr>
+          <w:rFonts w:ascii="Courier New" w:hAnsi="Courier New"/>
+          <w:sz w:val="18"/>
+        </w:rPr>
+        <w:t>groq:   rm -rf /tmp/*                          dangerous=true</w:t>
+      </w:r>
+      <w:r>
+        <w:rPr>
+          <w:rFonts w:ascii="Courier New" w:hAnsi="Courier New"/>
+          <w:sz w:val="18"/>
+        </w:rPr>
+        <w:br/>
+        <w:t>qwen3:  rm -rf /tmp/*                          dangerous=true</w:t>
+      </w:r>
+      <w:r>
+        <w:rPr>
+          <w:rFonts w:ascii="Courier New" w:hAnsi="Courier New"/>
+          <w:sz w:val="18"/>
+        </w:rPr>
+        <w:br/>
+        <w:t>gemma3: find /tmp -name '*temp*' -delete       dangerous=true</w:t>
+      </w:r>
+    </w:p>
+    <w:p>
+      <w:r>
+        <w:t>gemma3 used a narrower command (only deletes *temp* matches, not all files) but the dangerous flag was correct.</w:t>
+      </w:r>
+    </w:p>
+    <w:p>
+      <w:pPr>
+        <w:pStyle w:val="Heading2"/>
+      </w:pPr>
+      <w:r>
+        <w:t>Synthesis — what the comparison reveals</w:t>
+      </w:r>
+    </w:p>
+    <w:p>
+      <w:r>
+        <w:t>The failures are around two main things: structured output reliability and clarification decisions. qwen3 produced valid json on all 4 tests and asked for clarification on both ambiguous requests. gemma3 used markdown fences consistently (handled by fence-stripping), produced malformed json on the complex request (causing silent discard of the entire plan), and never once used type=clarification.</w:t>
+      </w:r>
+    </w:p>
+    <w:p>
+      <w:r>
+        <w:t xml:space="preserve">The root cause is that gemma3 </w:t>
+      </w:r>
+      <w:proofErr w:type="gramStart"/>
+      <w:r>
+        <w:t>was instruction</w:t>
+      </w:r>
+      <w:proofErr w:type="gramEnd"/>
+      <w:r>
+        <w:t xml:space="preserve"> </w:t>
+      </w:r>
+      <w:proofErr w:type="gramStart"/>
+      <w:r>
+        <w:t>tuned</w:t>
+      </w:r>
+      <w:proofErr w:type="gramEnd"/>
+      <w:r>
+        <w:t xml:space="preserve"> to be helpful in natural language, not to produce machine structured output as </w:t>
+      </w:r>
+      <w:proofErr w:type="gramStart"/>
+      <w:r>
+        <w:t>a</w:t>
+      </w:r>
+      <w:proofErr w:type="gramEnd"/>
+      <w:r>
+        <w:t xml:space="preserve"> objective. The json protocol is a soft pattern for it, not a hard constraint. qwen3 was trained with structured tool use as an explicit objective — JSON output is its native format and staying within the protocol is how it handles uncertainty (it asks and doesn't guess).</w:t>
+      </w:r>
+    </w:p>
+    <w:p>
+      <w:r>
+        <w:t>An unexpected finding: the API model (groq/llama-3.1-8b-instant) also failed on the second test due to a \; escape in the command string — valid bash but invalid json. This suggests a gap in the system prompt: it specifies the response format but does not remind models to json-escape backslashes in command strings.</w:t>
+      </w:r>
+    </w:p>
+    <w:p>
+      <w:pPr>
+        <w:pStyle w:val="Heading2"/>
+      </w:pPr>
+      <w:r>
+        <w:t>Limitations</w:t>
+      </w:r>
+    </w:p>
+    <w:p>
+      <w:pPr>
+        <w:pStyle w:val="ListBullet"/>
+      </w:pPr>
+      <w:r>
+        <w:t>Tests ran in isolation (no history or memory context). Real doit usage injects prior turns, which may affect the json compliance on follow-up requests.</w:t>
+      </w:r>
+    </w:p>
+    <w:p>
+      <w:pPr>
+        <w:pStyle w:val="ListBullet"/>
+      </w:pPr>
+      <w:r>
+        <w:t>gemma3</w:t>
+      </w:r>
+      <w:r>
+        <w:t xml:space="preserve"> </w:t>
+      </w:r>
+      <w:r>
+        <w:t xml:space="preserve"> fence</w:t>
+      </w:r>
+      <w:r>
+        <w:t xml:space="preserve"> </w:t>
+      </w:r>
+      <w:r>
+        <w:t xml:space="preserve">wrapping </w:t>
+      </w:r>
+      <w:r>
+        <w:t>behavior</w:t>
+      </w:r>
+      <w:r>
+        <w:t xml:space="preserve"> means every simple call </w:t>
+      </w:r>
+      <w:r>
+        <w:t>uses</w:t>
+      </w:r>
+      <w:r>
+        <w:t xml:space="preserve"> the fence</w:t>
+      </w:r>
+      <w:r>
+        <w:t xml:space="preserve"> </w:t>
+      </w:r>
+      <w:r>
+        <w:t>stripping regex. The fallback works on single</w:t>
+      </w:r>
+      <w:r>
+        <w:t xml:space="preserve"> </w:t>
+      </w:r>
+      <w:r>
+        <w:t>object responses</w:t>
+      </w:r>
+      <w:r>
+        <w:t>.</w:t>
+      </w:r>
+      <w:r>
+        <w:t xml:space="preserve"> </w:t>
+      </w:r>
+      <w:r>
+        <w:t>m</w:t>
+      </w:r>
+      <w:r>
+        <w:t>ulti</w:t>
+      </w:r>
+      <w:r>
+        <w:t xml:space="preserve"> </w:t>
+      </w:r>
+      <w:r>
+        <w:t xml:space="preserve">step responses expressed with embedded code fences are unrecoverable if the </w:t>
+      </w:r>
+      <w:r>
+        <w:t>json</w:t>
+      </w:r>
+      <w:r>
+        <w:t xml:space="preserve"> is also malformed.</w:t>
+      </w:r>
+    </w:p>
+    <w:p>
+      <w:pPr>
+        <w:pStyle w:val="ListBullet"/>
+        <w:numPr>
+          <w:ilvl w:val="0"/>
+          <w:numId w:val="0"/>
+        </w:numPr>
+        <w:ind w:left="360"/>
+      </w:pPr>
+    </w:p>
+    <w:p/>
+    <w:p>
+      <w:pPr>
+        <w:pStyle w:val="Heading1"/>
+      </w:pPr>
+      <w:r>
+        <w:lastRenderedPageBreak/>
+        <w:t>Section 4: Multi-Turn</w:t>
+      </w:r>
+    </w:p>
+    <w:p>
+      <w:pPr>
+        <w:pStyle w:val="Heading2"/>
+      </w:pPr>
+      <w:r>
+        <w:t>What was implemented</w:t>
+      </w:r>
+    </w:p>
+    <w:p>
+      <w:r>
+        <w:t xml:space="preserve">History is stored in ~/.doit/history.json. </w:t>
+      </w:r>
+      <w:r>
+        <w:t>each</w:t>
+      </w:r>
+      <w:r>
+        <w:t xml:space="preserve"> entry </w:t>
+      </w:r>
+      <w:r>
+        <w:t>saves</w:t>
+      </w:r>
+      <w:r>
+        <w:t xml:space="preserve"> session_id, timestamp, cwd, request, </w:t>
+      </w:r>
+      <w:r>
         <w:t>llm</w:t>
       </w:r>
-      <w:proofErr w:type="spellEnd"/>
-      <w:r>
-        <w:rPr>
-          <w:bCs/>
-          <w:color w:val="000000" w:themeColor="text1"/>
-        </w:rPr>
-        <w:t xml:space="preserve"> does not always </w:t>
-      </w:r>
-      <w:proofErr w:type="spellStart"/>
-      <w:r>
-        <w:rPr>
-          <w:bCs/>
-          <w:color w:val="000000" w:themeColor="text1"/>
-        </w:rPr>
-        <w:t>generalise</w:t>
-      </w:r>
-      <w:proofErr w:type="spellEnd"/>
-      <w:r>
-        <w:rPr>
-          <w:bCs/>
-          <w:color w:val="000000" w:themeColor="text1"/>
-        </w:rPr>
-        <w:t xml:space="preserve"> </w:t>
-      </w:r>
-      <w:r>
-        <w:rPr>
-          <w:bCs/>
-          <w:color w:val="000000" w:themeColor="text1"/>
-        </w:rPr>
-        <w:t>the dangerous scenarios.</w:t>
-      </w:r>
-    </w:p>
-    <w:p/>
-    <w:p>
-      <w:pPr>
-        <w:pStyle w:val="Heading1"/>
-      </w:pPr>
-      <w:r>
-        <w:t>Section 3: Model Flexibility</w:t>
-      </w:r>
-    </w:p>
-    <w:p>
-      <w:pPr>
-        <w:pStyle w:val="Heading2"/>
-      </w:pPr>
-      <w:r>
-        <w:t>What was implemented</w:t>
-      </w:r>
-    </w:p>
-    <w:p>
-      <w:r>
-        <w:t>~/doit.cfg selects the model and provider. _call_llm() passes the config directly to LiteLLM's completion() — no provider-specific code exists in doit. Three configurations were tested:</w:t>
-      </w:r>
-    </w:p>
-    <w:p>
-      <w:pPr>
-        <w:pStyle w:val="ListBullet"/>
-      </w:pPr>
-      <w:r>
-        <w:t>API: groq/llama-3.1-8b-instant</w:t>
-      </w:r>
-    </w:p>
-    <w:p>
-      <w:pPr>
-        <w:pStyle w:val="ListBullet"/>
-      </w:pPr>
-      <w:r>
-        <w:t>local_tools: ollama/qwen3:4b</w:t>
-      </w:r>
-    </w:p>
-    <w:p>
-      <w:pPr>
-        <w:pStyle w:val="ListBullet"/>
-      </w:pPr>
-      <w:r>
-        <w:t>local_no_tools: ollama/gemma3:4b</w:t>
-      </w:r>
-    </w:p>
-    <w:p>
-      <w:pPr>
-        <w:pStyle w:val="Heading2"/>
-      </w:pPr>
-      <w:r>
-        <w:t>doit.cfg examples</w:t>
-      </w:r>
-    </w:p>
-    <w:p>
-      <w:pPr>
-        <w:pStyle w:val="NoSpacing"/>
-        <w:shd w:val="clear" w:color="auto" w:fill="F0F0F0"/>
-      </w:pPr>
-      <w:r>
-        <w:rPr>
-          <w:rFonts w:ascii="Courier New" w:hAnsi="Courier New"/>
-          <w:sz w:val="18"/>
-        </w:rPr>
-        <w:t>{"model":"groq/llama-3.1-8b-instant","api_key":"gsk_...","api_base":"","model_type":"api"}</w:t>
-      </w:r>
-    </w:p>
-    <w:p/>
-    <w:p>
-      <w:pPr>
-        <w:pStyle w:val="NoSpacing"/>
-        <w:shd w:val="clear" w:color="auto" w:fill="F0F0F0"/>
-      </w:pPr>
-      <w:r>
-        <w:rPr>
-          <w:rFonts w:ascii="Courier New" w:hAnsi="Courier New"/>
-          <w:sz w:val="18"/>
-        </w:rPr>
-        <w:t>{"model":"ollama/qwen3:4b","api_key":"","api_base":"http://localhost:11434","model_type":"local_tools"}</w:t>
-      </w:r>
-    </w:p>
-    <w:p/>
-    <w:p>
-      <w:pPr>
-        <w:pStyle w:val="NoSpacing"/>
-        <w:shd w:val="clear" w:color="auto" w:fill="F0F0F0"/>
-      </w:pPr>
-      <w:r>
-        <w:rPr>
-          <w:rFonts w:ascii="Courier New" w:hAnsi="Courier New"/>
-          <w:sz w:val="18"/>
-        </w:rPr>
-        <w:t>{"model":"ollama/gemma3:4b","api_key":"","api_base":"http://localhost:11434","model_type":"local_no_tools"}</w:t>
-      </w:r>
-    </w:p>
-    <w:p>
-      <w:pPr>
-        <w:pStyle w:val="Heading2"/>
-      </w:pPr>
-      <w:r>
-        <w:t>Model comparison — same request, all three models</w:t>
-      </w:r>
-    </w:p>
-    <w:p>
-      <w:r>
-        <w:rPr>
-          <w:b/>
-          <w:color w:val="005FAF"/>
-        </w:rPr>
-        <w:t>doit "list all python files in this directory" — groq/llama-3.1-8b-instant (real run)</w:t>
-      </w:r>
-    </w:p>
-    <w:p>
-      <w:pPr>
-        <w:pStyle w:val="NoSpacing"/>
-        <w:shd w:val="clear" w:color="auto" w:fill="F0F0F0"/>
-      </w:pPr>
-      <w:r>
-        <w:rPr>
-          <w:rFonts w:ascii="Courier New" w:hAnsi="Courier New"/>
-          <w:sz w:val="18"/>
-        </w:rPr>
-        <w:t>$ find . -type f -name *.py</w:t>
-      </w:r>
-    </w:p>
-    <w:p>
-      <w:pPr>
-        <w:pStyle w:val="NoSpacing"/>
-        <w:shd w:val="clear" w:color="auto" w:fill="F0F0F0"/>
-      </w:pPr>
-      <w:r>
-        <w:rPr>
-          <w:rFonts w:ascii="Courier New" w:hAnsi="Courier New"/>
-          <w:sz w:val="18"/>
-        </w:rPr>
-        <w:t xml:space="preserve">  -&gt; List all Python files in the current directory and its subdirectories</w:t>
-      </w:r>
-    </w:p>
-    <w:p>
-      <w:pPr>
-        <w:pStyle w:val="NoSpacing"/>
-        <w:shd w:val="clear" w:color="auto" w:fill="F0F0F0"/>
-      </w:pPr>
-      <w:r>
-        <w:rPr>
-          <w:rFonts w:ascii="Courier New" w:hAnsi="Courier New"/>
-          <w:sz w:val="18"/>
-        </w:rPr>
-        <w:t>./test.py</w:t>
-      </w:r>
-    </w:p>
-    <w:p>
-      <w:r>
-        <w:rPr>
-          <w:b/>
-          <w:color w:val="005FAF"/>
-        </w:rPr>
-        <w:t>same request — ollama/qwen3:4b (representative output, ~35s on CPU)</w:t>
-      </w:r>
-    </w:p>
-    <w:p>
-      <w:pPr>
-        <w:pStyle w:val="NoSpacing"/>
-        <w:shd w:val="clear" w:color="auto" w:fill="F0F0F0"/>
-      </w:pPr>
-      <w:r>
-        <w:rPr>
-          <w:rFonts w:ascii="Courier New" w:hAnsi="Courier New"/>
-          <w:sz w:val="18"/>
-        </w:rPr>
-        <w:t>$ find . -name "*.py"</w:t>
-      </w:r>
-    </w:p>
-    <w:p>
-      <w:pPr>
-        <w:pStyle w:val="NoSpacing"/>
-        <w:shd w:val="clear" w:color="auto" w:fill="F0F0F0"/>
-      </w:pPr>
-      <w:r>
-        <w:rPr>
-          <w:rFonts w:ascii="Courier New" w:hAnsi="Courier New"/>
-          <w:sz w:val="18"/>
-        </w:rPr>
-        <w:t xml:space="preserve">  -&gt; Find all Python files in the current directory</w:t>
-      </w:r>
-    </w:p>
-    <w:p>
-      <w:pPr>
-        <w:pStyle w:val="NoSpacing"/>
-        <w:shd w:val="clear" w:color="auto" w:fill="F0F0F0"/>
-      </w:pPr>
-      <w:r>
-        <w:rPr>
-          <w:rFonts w:ascii="Courier New" w:hAnsi="Courier New"/>
-          <w:sz w:val="18"/>
-        </w:rPr>
-        <w:t>./test.py</w:t>
-      </w:r>
-    </w:p>
-    <w:p>
-      <w:r>
-        <w:rPr>
-          <w:b/>
-          <w:color w:val="005FAF"/>
-        </w:rPr>
-        <w:t>same request — ollama/gemma3:4b (representative output, ~45s on CPU)</w:t>
-      </w:r>
-    </w:p>
-    <w:p>
-      <w:pPr>
-        <w:pStyle w:val="NoSpacing"/>
-        <w:shd w:val="clear" w:color="auto" w:fill="F0F0F0"/>
-      </w:pPr>
-      <w:r>
-        <w:rPr>
-          <w:rFonts w:ascii="Courier New" w:hAnsi="Courier New"/>
-          <w:sz w:val="18"/>
-        </w:rPr>
-        <w:lastRenderedPageBreak/>
-        <w:t>Sure! Here's the command to list all Python files in the current directory:</w:t>
-      </w:r>
-    </w:p>
-    <w:p>
-      <w:pPr>
-        <w:pStyle w:val="NoSpacing"/>
-        <w:shd w:val="clear" w:color="auto" w:fill="F0F0F0"/>
-      </w:pPr>
-      <w:r>
-        <w:rPr>
-          <w:rFonts w:ascii="Courier New" w:hAnsi="Courier New"/>
-          <w:sz w:val="18"/>
-        </w:rPr>
-        <w:t>{"type":"command","command":"find . -name '*.py'","description":"List Python files","dangerous":false}</w:t>
-      </w:r>
-    </w:p>
-    <w:p>
-      <w:pPr>
-        <w:pStyle w:val="NoSpacing"/>
-        <w:shd w:val="clear" w:color="auto" w:fill="F0F0F0"/>
-      </w:pPr>
-      <w:r>
-        <w:rPr>
-          <w:rFonts w:ascii="Courier New" w:hAnsi="Courier New"/>
-          <w:sz w:val="18"/>
-        </w:rPr>
-        <w:t xml:space="preserve">  -&gt; (prose prefix stripped by regex fallback in _call_llm())</w:t>
-      </w:r>
-    </w:p>
-    <w:p>
-      <w:pPr>
-        <w:pStyle w:val="NoSpacing"/>
-        <w:shd w:val="clear" w:color="auto" w:fill="F0F0F0"/>
-      </w:pPr>
-      <w:r>
-        <w:rPr>
-          <w:rFonts w:ascii="Courier New" w:hAnsi="Courier New"/>
-          <w:sz w:val="18"/>
-        </w:rPr>
-        <w:t>./test.py</w:t>
-      </w:r>
-    </w:p>
-    <w:p>
-      <w:pPr>
-        <w:pStyle w:val="Heading2"/>
-      </w:pPr>
-      <w:r>
-        <w:t>Local model comparison — where they differ</w:t>
-      </w:r>
-    </w:p>
-    <w:p>
-      <w:r>
-        <w:t>On simple requests both local models eventually produce correct output. The differences emerge on three axes: structured output format, clarification decisions, and dangerous-command classification.</w:t>
-      </w:r>
-    </w:p>
-    <w:p>
-      <w:pPr>
-        <w:pStyle w:val="Heading3"/>
-      </w:pPr>
-      <w:r>
-        <w:t>Failure 1: structured output — complex multi-step request</w:t>
-      </w:r>
-    </w:p>
-    <w:p>
-      <w:r>
-        <w:t>For a more complex request, gemma3 (instruction-tuned, no tool-calling training) produced output that even the regex fallback could not recover:</w:t>
-      </w:r>
-    </w:p>
-    <w:p>
-      <w:r>
-        <w:rPr>
-          <w:b/>
-          <w:color w:val="005FAF"/>
-        </w:rPr>
-        <w:t>doit "find all files modified in the last 24 hours and move them to a backup folder" — ollama/gemma3:4b</w:t>
-      </w:r>
-    </w:p>
-    <w:p>
-      <w:pPr>
-        <w:pStyle w:val="NoSpacing"/>
-        <w:shd w:val="clear" w:color="auto" w:fill="F0F0F0"/>
-      </w:pPr>
-      <w:r>
-        <w:rPr>
-          <w:rFonts w:ascii="Courier New" w:hAnsi="Courier New"/>
-          <w:sz w:val="18"/>
-        </w:rPr>
-        <w:t>I'll help you with that! Here's what you need to do:</w:t>
-      </w:r>
-    </w:p>
-    <w:p>
-      <w:pPr>
-        <w:pStyle w:val="NoSpacing"/>
-        <w:shd w:val="clear" w:color="auto" w:fill="F0F0F0"/>
-      </w:pPr>
-      <w:r>
-        <w:rPr>
-          <w:rFonts w:ascii="Courier New" w:hAnsi="Courier New"/>
-          <w:sz w:val="18"/>
-        </w:rPr>
-        <w:t xml:space="preserve"> </w:t>
-      </w:r>
-    </w:p>
-    <w:p>
-      <w:pPr>
-        <w:pStyle w:val="NoSpacing"/>
-        <w:shd w:val="clear" w:color="auto" w:fill="F0F0F0"/>
-      </w:pPr>
-      <w:r>
-        <w:rPr>
-          <w:rFonts w:ascii="Courier New" w:hAnsi="Courier New"/>
-          <w:sz w:val="18"/>
-        </w:rPr>
-        <w:t>Step 1 - find the files:</w:t>
-      </w:r>
-    </w:p>
-    <w:p>
-      <w:pPr>
-        <w:pStyle w:val="NoSpacing"/>
-        <w:shd w:val="clear" w:color="auto" w:fill="F0F0F0"/>
-      </w:pPr>
-      <w:r>
-        <w:rPr>
-          <w:rFonts w:ascii="Courier New" w:hAnsi="Courier New"/>
-          <w:sz w:val="18"/>
-        </w:rPr>
-        <w:t xml:space="preserve">  find . -mtime -1 -type f</w:t>
-      </w:r>
-    </w:p>
-    <w:p>
-      <w:pPr>
-        <w:pStyle w:val="NoSpacing"/>
-        <w:shd w:val="clear" w:color="auto" w:fill="F0F0F0"/>
-      </w:pPr>
-      <w:r>
-        <w:rPr>
-          <w:rFonts w:ascii="Courier New" w:hAnsi="Courier New"/>
-          <w:sz w:val="18"/>
-        </w:rPr>
-        <w:t xml:space="preserve"> </w:t>
-      </w:r>
-    </w:p>
-    <w:p>
-      <w:pPr>
-        <w:pStyle w:val="NoSpacing"/>
-        <w:shd w:val="clear" w:color="auto" w:fill="F0F0F0"/>
-      </w:pPr>
-      <w:r>
-        <w:rPr>
-          <w:rFonts w:ascii="Courier New" w:hAnsi="Courier New"/>
-          <w:sz w:val="18"/>
-        </w:rPr>
-        <w:t>Step 2 - move them:</w:t>
-      </w:r>
-    </w:p>
-    <w:p>
-      <w:pPr>
-        <w:pStyle w:val="NoSpacing"/>
-        <w:shd w:val="clear" w:color="auto" w:fill="F0F0F0"/>
-      </w:pPr>
-      <w:r>
-        <w:rPr>
-          <w:rFonts w:ascii="Courier New" w:hAnsi="Courier New"/>
-          <w:sz w:val="18"/>
-        </w:rPr>
-        <w:t xml:space="preserve">  mv $(find . -mtime -1 -type f) ./backup/</w:t>
-      </w:r>
-    </w:p>
-    <w:p>
-      <w:pPr>
-        <w:pStyle w:val="NoSpacing"/>
-        <w:shd w:val="clear" w:color="auto" w:fill="F0F0F0"/>
-      </w:pPr>
-      <w:r>
-        <w:rPr>
-          <w:rFonts w:ascii="Courier New" w:hAnsi="Courier New"/>
-          <w:sz w:val="18"/>
-        </w:rPr>
-        <w:t xml:space="preserve"> </w:t>
-      </w:r>
-    </w:p>
-    <w:p>
-      <w:pPr>
-        <w:pStyle w:val="NoSpacing"/>
-        <w:shd w:val="clear" w:color="auto" w:fill="F0F0F0"/>
-      </w:pPr>
-      <w:r>
-        <w:rPr>
-          <w:rFonts w:ascii="Courier New" w:hAnsi="Courier New"/>
-          <w:sz w:val="18"/>
-        </w:rPr>
-        <w:t>Make sure the backup folder exists first.</w:t>
-      </w:r>
-    </w:p>
-    <w:p>
-      <w:proofErr w:type="gramStart"/>
-      <w:r>
-        <w:t>n</w:t>
-      </w:r>
-      <w:r>
-        <w:t>o</w:t>
-      </w:r>
-      <w:proofErr w:type="gramEnd"/>
-      <w:r>
-        <w:t xml:space="preserve"> JSON object was present</w:t>
-      </w:r>
-      <w:r>
-        <w:t>ed</w:t>
-      </w:r>
-      <w:r>
-        <w:t xml:space="preserve"> in the response. The regex fallback found nothing to extract, so _call_llm() returned {"type":"answer","text":"..."} with the prose — the request was treated as an informational answer instead of a command.</w:t>
-      </w:r>
-    </w:p>
-    <w:p>
-      <w:r>
-        <w:rPr>
-          <w:b/>
-          <w:color w:val="005FAF"/>
-        </w:rPr>
-        <w:t>same request — ollama/qwen3:4b (tool-calling trained)</w:t>
-      </w:r>
-    </w:p>
-    <w:p>
-      <w:pPr>
-        <w:pStyle w:val="NoSpacing"/>
-        <w:shd w:val="clear" w:color="auto" w:fill="F0F0F0"/>
-      </w:pPr>
-      <w:r>
-        <w:rPr>
-          <w:rFonts w:ascii="Courier New" w:hAnsi="Courier New"/>
-          <w:sz w:val="18"/>
-        </w:rPr>
-        <w:t>{"type":"multi_step","description":"Find and move recently modified files to backup"</w:t>
-      </w:r>
-    </w:p>
-    <w:p>
-      <w:pPr>
-        <w:pStyle w:val="NoSpacing"/>
-        <w:shd w:val="clear" w:color="auto" w:fill="F0F0F0"/>
-      </w:pPr>
-      <w:r>
-        <w:rPr>
-          <w:rFonts w:ascii="Courier New" w:hAnsi="Courier New"/>
-          <w:sz w:val="18"/>
-        </w:rPr>
-        <w:t xml:space="preserve"> "steps":[</w:t>
-      </w:r>
-    </w:p>
-    <w:p>
-      <w:pPr>
-        <w:pStyle w:val="NoSpacing"/>
-        <w:shd w:val="clear" w:color="auto" w:fill="F0F0F0"/>
-      </w:pPr>
-      <w:r>
-        <w:rPr>
-          <w:rFonts w:ascii="Courier New" w:hAnsi="Courier New"/>
-          <w:sz w:val="18"/>
-        </w:rPr>
-        <w:t xml:space="preserve">   {"command":"mkdir -p backup","description":"Ensure backup folder exists","dangerous":false},</w:t>
-      </w:r>
-    </w:p>
-    <w:p>
-      <w:pPr>
-        <w:pStyle w:val="NoSpacing"/>
-        <w:shd w:val="clear" w:color="auto" w:fill="F0F0F0"/>
-      </w:pPr>
-      <w:r>
-        <w:rPr>
-          <w:rFonts w:ascii="Courier New" w:hAnsi="Courier New"/>
-          <w:sz w:val="18"/>
-        </w:rPr>
-        <w:t xml:space="preserve">   {"command":"find . -mtime -1 -type f -exec mv {} backup/ \\;",</w:t>
-      </w:r>
-    </w:p>
-    <w:p>
-      <w:pPr>
-        <w:pStyle w:val="NoSpacing"/>
-        <w:shd w:val="clear" w:color="auto" w:fill="F0F0F0"/>
-      </w:pPr>
-      <w:r>
-        <w:rPr>
-          <w:rFonts w:ascii="Courier New" w:hAnsi="Courier New"/>
-          <w:sz w:val="18"/>
-        </w:rPr>
-        <w:t xml:space="preserve">    "description":"Move files modified in last 24h","dangerous":true}</w:t>
-      </w:r>
-    </w:p>
-    <w:p>
-      <w:pPr>
-        <w:pStyle w:val="NoSpacing"/>
-        <w:shd w:val="clear" w:color="auto" w:fill="F0F0F0"/>
-      </w:pPr>
-      <w:r>
-        <w:rPr>
-          <w:rFonts w:ascii="Courier New" w:hAnsi="Courier New"/>
-          <w:sz w:val="18"/>
-        </w:rPr>
-        <w:t xml:space="preserve"> ]}</w:t>
-      </w:r>
-    </w:p>
-    <w:p>
-      <w:pPr>
-        <w:pStyle w:val="Heading3"/>
-      </w:pPr>
-      <w:r>
-        <w:t>Failure 2: clarification on ambiguous request</w:t>
-      </w:r>
-    </w:p>
-    <w:p>
-      <w:r>
-        <w:t>Given a deliberately underspecified request ("move the files"), the two models produced different strategies:</w:t>
-      </w:r>
-    </w:p>
-    <w:p>
-      <w:r>
-        <w:rPr>
-          <w:b/>
-          <w:color w:val="005FAF"/>
-        </w:rPr>
-        <w:t>doit "move the files" — ollama/gemma3:4b</w:t>
-      </w:r>
-    </w:p>
-    <w:p>
-      <w:pPr>
-        <w:pStyle w:val="NoSpacing"/>
-        <w:shd w:val="clear" w:color="auto" w:fill="F0F0F0"/>
-      </w:pPr>
-      <w:r>
-        <w:rPr>
-          <w:rFonts w:ascii="Courier New" w:hAnsi="Courier New"/>
-          <w:sz w:val="18"/>
-        </w:rPr>
-        <w:t>$ mv * ~/Documents/</w:t>
-      </w:r>
-    </w:p>
-    <w:p>
-      <w:pPr>
-        <w:pStyle w:val="NoSpacing"/>
-        <w:shd w:val="clear" w:color="auto" w:fill="F0F0F0"/>
-      </w:pPr>
-      <w:r>
-        <w:rPr>
-          <w:rFonts w:ascii="Courier New" w:hAnsi="Courier New"/>
-          <w:sz w:val="18"/>
-        </w:rPr>
-        <w:t xml:space="preserve">  -&gt; Move all files to the Documents folder</w:t>
-      </w:r>
-    </w:p>
-    <w:p>
-      <w:r>
-        <w:t xml:space="preserve">gemma3 silently chose a destination and ran the command without flagging </w:t>
-      </w:r>
-      <w:r>
-        <w:t>that's unclear</w:t>
-      </w:r>
-      <w:r>
-        <w:t xml:space="preserve">. </w:t>
-      </w:r>
-      <w:r>
-        <w:t>I</w:t>
-      </w:r>
-      <w:r>
-        <w:t>t</w:t>
-      </w:r>
-      <w:r>
-        <w:t xml:space="preserve"> was </w:t>
-      </w:r>
-      <w:r>
-        <w:t>executed immediately with no confirmation — moving every file in the working directory.</w:t>
-      </w:r>
-    </w:p>
-    <w:p>
-      <w:r>
-        <w:rPr>
-          <w:b/>
-          <w:color w:val="005FAF"/>
-        </w:rPr>
-        <w:lastRenderedPageBreak/>
-        <w:t>same request — ollama/qwen3:4b</w:t>
-      </w:r>
-    </w:p>
-    <w:p>
-      <w:pPr>
-        <w:pStyle w:val="NoSpacing"/>
-        <w:shd w:val="clear" w:color="auto" w:fill="F0F0F0"/>
-      </w:pPr>
-      <w:r>
-        <w:rPr>
-          <w:rFonts w:ascii="Courier New" w:hAnsi="Courier New"/>
-          <w:sz w:val="18"/>
-        </w:rPr>
-        <w:t>{"type":"clarification",</w:t>
-      </w:r>
-    </w:p>
-    <w:p>
-      <w:pPr>
-        <w:pStyle w:val="NoSpacing"/>
-        <w:shd w:val="clear" w:color="auto" w:fill="F0F0F0"/>
-      </w:pPr>
-      <w:r>
-        <w:rPr>
-          <w:rFonts w:ascii="Courier New" w:hAnsi="Courier New"/>
-          <w:sz w:val="18"/>
-        </w:rPr>
-        <w:t xml:space="preserve"> "question":"Which files should I move, and to which destination?",</w:t>
-      </w:r>
-    </w:p>
-    <w:p>
-      <w:pPr>
-        <w:pStyle w:val="NoSpacing"/>
-        <w:shd w:val="clear" w:color="auto" w:fill="F0F0F0"/>
-      </w:pPr>
-      <w:r>
-        <w:rPr>
-          <w:rFonts w:ascii="Courier New" w:hAnsi="Courier New"/>
-          <w:sz w:val="18"/>
-        </w:rPr>
-        <w:t xml:space="preserve"> "options":["Specify source files and target directory",</w:t>
-      </w:r>
-    </w:p>
-    <w:p>
-      <w:pPr>
-        <w:pStyle w:val="NoSpacing"/>
-        <w:shd w:val="clear" w:color="auto" w:fill="F0F0F0"/>
-      </w:pPr>
-      <w:r>
-        <w:rPr>
-          <w:rFonts w:ascii="Courier New" w:hAnsi="Courier New"/>
-          <w:sz w:val="18"/>
-        </w:rPr>
-        <w:t xml:space="preserve">            "Move all files in the current directory to ~/Documents"]}</w:t>
-      </w:r>
-    </w:p>
-    <w:p>
-      <w:r>
-        <w:t xml:space="preserve">qwen3 correctly identified the request as </w:t>
-      </w:r>
-      <w:r>
-        <w:t>unclear</w:t>
-      </w:r>
-      <w:r>
-        <w:t xml:space="preserve"> and used type=clarification before taking any action. This matches the intended design</w:t>
-      </w:r>
-      <w:r>
-        <w:t>,</w:t>
-      </w:r>
-      <w:r>
-        <w:t xml:space="preserve"> qwen3</w:t>
-      </w:r>
-      <w:r>
-        <w:t xml:space="preserve"> performance was better likely </w:t>
-      </w:r>
-      <w:r>
-        <w:t>because clarification is part of its structured</w:t>
-      </w:r>
-      <w:r>
-        <w:t xml:space="preserve"> </w:t>
-      </w:r>
-      <w:r>
-        <w:t>output training.</w:t>
-      </w:r>
-    </w:p>
-    <w:p>
-      <w:pPr>
-        <w:pStyle w:val="Heading3"/>
-      </w:pPr>
-      <w:r>
-        <w:t>Failure 3: dangerous-command classification</w:t>
-      </w:r>
-    </w:p>
-    <w:p>
-      <w:r>
-        <w:t>gemma3 also showed inconsistency in dangerous flag classification. For the request "clean up temp files in /tmp", it produced:</w:t>
-      </w:r>
-    </w:p>
-    <w:p>
-      <w:r>
-        <w:rPr>
-          <w:b/>
-          <w:color w:val="005FAF"/>
-        </w:rPr>
-        <w:t>ollama/gemma3:4b</w:t>
-      </w:r>
-    </w:p>
-    <w:p>
-      <w:pPr>
-        <w:pStyle w:val="NoSpacing"/>
-        <w:shd w:val="clear" w:color="auto" w:fill="F0F0F0"/>
-      </w:pPr>
-      <w:r>
-        <w:rPr>
-          <w:rFonts w:ascii="Courier New" w:hAnsi="Courier New"/>
-          <w:sz w:val="18"/>
-        </w:rPr>
-        <w:t>{"type":"command","command":"rm -rf /tmp/*",</w:t>
-      </w:r>
-    </w:p>
-    <w:p>
-      <w:pPr>
-        <w:pStyle w:val="NoSpacing"/>
-        <w:shd w:val="clear" w:color="auto" w:fill="F0F0F0"/>
-      </w:pPr>
-      <w:r>
-        <w:rPr>
-          <w:rFonts w:ascii="Courier New" w:hAnsi="Courier New"/>
-          <w:sz w:val="18"/>
-        </w:rPr>
-        <w:t xml:space="preserve"> "description":"Remove all temporary files","dangerous":false}</w:t>
-      </w:r>
-    </w:p>
-    <w:p>
-      <w:r>
-        <w:t xml:space="preserve">dangerous=false on rm -rf is a clear misclassification. The system prompt explicitly lists rm as dangerous, but gemma3 did not apply </w:t>
-      </w:r>
-      <w:r>
-        <w:t>it due to user prompt pressure</w:t>
-      </w:r>
-      <w:r>
-        <w:t xml:space="preserve">. </w:t>
-      </w:r>
-      <w:r>
-        <w:t xml:space="preserve"> Thise while </w:t>
-      </w:r>
-      <w:r>
-        <w:t xml:space="preserve">qwen3 correctly </w:t>
-      </w:r>
-      <w:r>
-        <w:t xml:space="preserve">triggered </w:t>
-      </w:r>
-      <w:r>
-        <w:t>the y/N confirmation prompt before execution.</w:t>
-      </w:r>
-    </w:p>
-    <w:p>
-      <w:pPr>
-        <w:pStyle w:val="Heading2"/>
-      </w:pPr>
-      <w:r>
-        <w:t>Synthesis — what the comparison reveals</w:t>
-      </w:r>
-    </w:p>
-    <w:p>
-      <w:r>
-        <w:t>The failures across those 3 aspects (structured output format, clarification decisions, and dangerous-command classification) all share the same root cause: gemma3:4b learned these behaviours from examples in its instruction fine</w:t>
-      </w:r>
-      <w:r>
-        <w:t xml:space="preserve"> </w:t>
-      </w:r>
-      <w:r>
-        <w:t xml:space="preserve">tuning, </w:t>
-      </w:r>
-      <w:r>
-        <w:t>that's while</w:t>
-      </w:r>
-      <w:r>
-        <w:t xml:space="preserve"> qwen3:4b was explicitly trained with structured tool</w:t>
-      </w:r>
-      <w:r>
-        <w:t xml:space="preserve"> </w:t>
-      </w:r>
-      <w:r>
-        <w:t xml:space="preserve">use as </w:t>
-      </w:r>
-      <w:proofErr w:type="gramStart"/>
-      <w:r>
-        <w:t>a</w:t>
-      </w:r>
-      <w:proofErr w:type="gramEnd"/>
-      <w:r>
-        <w:t xml:space="preserve"> objective.</w:t>
-      </w:r>
-    </w:p>
-    <w:p>
-      <w:r>
-        <w:t>For gemma3, each of these behaviours is a soft pattern that competes with the model's prior to "explain helpfully". Under any pressure — a complex request, an ambiguous goal, or an unfamiliar dangerous pattern — the explanation prior wins and the structured behaviour breaks down. The result is prose where JSON was expected, guessing where clarification was warranted, and under-flagging where a dangerous confirmation was required.</w:t>
-      </w:r>
-    </w:p>
-    <w:p>
-      <w:r>
-        <w:t>For qwen3, these behaviours are native output formats. The model has a strong prior that its output must be a JSON object matching a schema, and choosing between type=command, type=clarification, or setting dangerous=true are decisions it was trained to make explicitly. This means it degrades gracefully: even on novel or ambiguous inputs it stays within the protocol rather than escaping to prose.</w:t>
-      </w:r>
-    </w:p>
-    <w:p>
-      <w:r>
-        <w:t>The practical implication for doit is that the JSON-in-prompt approach works reliably only with a model trained for tool-calling. Using an instruction-only model requires either accepting frequent regex rescues (and silent failures for multi-step responses) or switching to a heavier prompting strategy (like some few-shot examples of every response type before each call).</w:t>
-      </w:r>
-    </w:p>
-    <w:p>
-      <w:pPr>
-        <w:pStyle w:val="Heading2"/>
-      </w:pPr>
-      <w:r>
-        <w:t>Limitations</w:t>
-      </w:r>
-    </w:p>
-    <w:p>
-      <w:pPr>
-        <w:pStyle w:val="ListBullet"/>
-      </w:pPr>
-      <w:r>
-        <w:t>On weak hardware (like my pc :) local models take much more time per call.</w:t>
-      </w:r>
-    </w:p>
-    <w:p>
-      <w:pPr>
-        <w:pStyle w:val="ListBullet"/>
-      </w:pPr>
-      <w:r>
-        <w:lastRenderedPageBreak/>
-        <w:t>gemma3 requires the regex fallback frequently and fails completely on complex requests — the regex fallback only recovers a single JSON object, so multi-step responses expressed as prose with embedded snippets are unrecoverable.</w:t>
-      </w:r>
-    </w:p>
-    <w:p/>
-    <w:p>
-      <w:pPr>
-        <w:pStyle w:val="Heading1"/>
-      </w:pPr>
-      <w:r>
-        <w:t>Section 4: Multi-Turn</w:t>
-      </w:r>
-    </w:p>
-    <w:p>
-      <w:pPr>
-        <w:pStyle w:val="Heading2"/>
-      </w:pPr>
-      <w:r>
-        <w:t>What was implemented</w:t>
-      </w:r>
-    </w:p>
-    <w:p>
-      <w:r>
-        <w:t>History is stored in ~/.doit/</w:t>
-      </w:r>
-      <w:proofErr w:type="spellStart"/>
-      <w:r>
-        <w:t>history.json</w:t>
-      </w:r>
-      <w:proofErr w:type="spellEnd"/>
-      <w:r>
-        <w:t xml:space="preserve">. </w:t>
-      </w:r>
-      <w:r>
-        <w:t>each</w:t>
-      </w:r>
-      <w:r>
-        <w:t xml:space="preserve"> entry </w:t>
-      </w:r>
-      <w:r>
-        <w:t>saves</w:t>
-      </w:r>
-      <w:r>
-        <w:t xml:space="preserve"> </w:t>
-      </w:r>
-      <w:proofErr w:type="spellStart"/>
-      <w:r>
-        <w:t>session_id</w:t>
-      </w:r>
-      <w:proofErr w:type="spellEnd"/>
-      <w:r>
-        <w:t xml:space="preserve">, timestamp, </w:t>
-      </w:r>
-      <w:proofErr w:type="spellStart"/>
-      <w:r>
-        <w:t>cwd</w:t>
-      </w:r>
-      <w:proofErr w:type="spellEnd"/>
-      <w:r>
-        <w:t xml:space="preserve">, request, </w:t>
-      </w:r>
-      <w:proofErr w:type="spellStart"/>
-      <w:r>
-        <w:t>llm</w:t>
-      </w:r>
-      <w:proofErr w:type="spellEnd"/>
       <w:r>
         <w:t xml:space="preserve"> response, and </w:t>
       </w:r>
@@ -1925,15 +1502,7 @@
         <w:t xml:space="preserve">the </w:t>
       </w:r>
       <w:r>
-        <w:t>result. _</w:t>
-      </w:r>
-      <w:proofErr w:type="spellStart"/>
-      <w:r>
-        <w:t>build_messages</w:t>
-      </w:r>
-      <w:proofErr w:type="spellEnd"/>
-      <w:r>
-        <w:t>() loads the last 10 entries for the session and injects them as alternating user/assistant turns, with execution output appended as a user message after each command.</w:t>
+        <w:t>result. _build_messages() loads the last 10 entries for the session and injects them as alternating user/assistant turns, with execution output appended as a user message after each command.</w:t>
       </w:r>
     </w:p>
     <w:p>
@@ -2088,7 +1657,6 @@
           <w:rFonts w:ascii="Courier New" w:hAnsi="Courier New"/>
           <w:sz w:val="18"/>
         </w:rPr>
-        <w:lastRenderedPageBreak/>
         <w:t>$ python --version</w:t>
       </w:r>
     </w:p>
@@ -2150,23 +1718,7 @@
     </w:p>
     <w:p>
       <w:r>
-        <w:t xml:space="preserve">type="clarification" is one of the standard JSON response types. </w:t>
-      </w:r>
-      <w:proofErr w:type="spellStart"/>
-      <w:r>
-        <w:t>handle_clarification</w:t>
-      </w:r>
-      <w:proofErr w:type="spellEnd"/>
-      <w:r>
-        <w:t>() prints the question and options, reads the answer, then calls _</w:t>
-      </w:r>
-      <w:proofErr w:type="spellStart"/>
-      <w:r>
-        <w:t>call_llm</w:t>
-      </w:r>
-      <w:proofErr w:type="spellEnd"/>
-      <w:r>
-        <w:t>() again with the answer appended. The result is processed normally — it could be a command, an answer, or another clarification. Empty input or Ctrl</w:t>
+        <w:t>type="clarification" is one of the standard JSON response types. handle_clarification() prints the question and options, reads the answer, then calls _call_llm() again with the answer appended. The result is processed normally — it could be a command, an answer, or another clarification. Empty input or Ctrl</w:t>
       </w:r>
       <w:r>
         <w:t xml:space="preserve"> </w:t>
@@ -2363,15 +1915,7 @@
     </w:p>
     <w:p>
       <w:r>
-        <w:t xml:space="preserve">The </w:t>
-      </w:r>
-      <w:proofErr w:type="spellStart"/>
-      <w:r>
-        <w:t>Groq</w:t>
-      </w:r>
-      <w:proofErr w:type="spellEnd"/>
-      <w:r>
-        <w:t xml:space="preserve"> llama-3.1-8b model rarely triggers clarification spontaneously — it tends to </w:t>
+        <w:t xml:space="preserve">The Groq llama-3.1-8b model rarely triggers clarification spontaneously — it tends to </w:t>
       </w:r>
       <w:r>
         <w:t xml:space="preserve">just guess </w:t>
@@ -2402,14 +1946,9 @@
       <w:r>
         <w:t>up command after clarification was incorrect in this run (stat -c rather than ls -</w:t>
       </w:r>
-      <w:proofErr w:type="spellStart"/>
       <w:proofErr w:type="gramStart"/>
       <w:r>
-        <w:t>lt</w:t>
-      </w:r>
-      <w:proofErr w:type="spellEnd"/>
-      <w:r>
-        <w:t>) —</w:t>
+        <w:t>lt) —</w:t>
       </w:r>
       <w:proofErr w:type="gramEnd"/>
       <w:r>
@@ -2422,48 +1961,48 @@
         <w:pStyle w:val="Heading1"/>
       </w:pPr>
       <w:r>
+        <w:t>Section 6: Richer Interactions</w:t>
+      </w:r>
+    </w:p>
+    <w:p>
+      <w:pPr>
+        <w:pStyle w:val="Heading2"/>
+      </w:pPr>
+      <w:r>
+        <w:t>What was implemented</w:t>
+      </w:r>
+    </w:p>
+    <w:p>
+      <w:r>
+        <w:t>type="answer" handles all non</w:t>
+      </w:r>
+      <w:r>
+        <w:t xml:space="preserve"> </w:t>
+      </w:r>
+      <w:r>
+        <w:t xml:space="preserve">command requests. The system prompt states: "When a user asks a question like how </w:t>
+      </w:r>
+      <w:proofErr w:type="gramStart"/>
+      <w:r>
+        <w:t>do I.</w:t>
+      </w:r>
+      <w:proofErr w:type="gramEnd"/>
+      <w:r>
+        <w:t>.., respond with type=answer, not type=command." Follow</w:t>
+      </w:r>
+      <w:r>
+        <w:t xml:space="preserve"> </w:t>
+      </w:r>
+      <w:r>
+        <w:t>ups like "execute it" work because the full prior assistant response is in the history context.</w:t>
+      </w:r>
+    </w:p>
+    <w:p>
+      <w:pPr>
+        <w:pStyle w:val="Heading2"/>
+      </w:pPr>
+      <w:r>
         <w:lastRenderedPageBreak/>
-        <w:t>Section 6: Richer Interactions</w:t>
-      </w:r>
-    </w:p>
-    <w:p>
-      <w:pPr>
-        <w:pStyle w:val="Heading2"/>
-      </w:pPr>
-      <w:r>
-        <w:t>What was implemented</w:t>
-      </w:r>
-    </w:p>
-    <w:p>
-      <w:r>
-        <w:t>type="answer" handles all non</w:t>
-      </w:r>
-      <w:r>
-        <w:t xml:space="preserve"> </w:t>
-      </w:r>
-      <w:r>
-        <w:t xml:space="preserve">command requests. The system prompt states: "When a user asks a question like how </w:t>
-      </w:r>
-      <w:proofErr w:type="gramStart"/>
-      <w:r>
-        <w:t>do I.</w:t>
-      </w:r>
-      <w:proofErr w:type="gramEnd"/>
-      <w:r>
-        <w:t>.., respond with type=answer, not type=command." Follow</w:t>
-      </w:r>
-      <w:r>
-        <w:t xml:space="preserve"> </w:t>
-      </w:r>
-      <w:r>
-        <w:t>ups like "execute it" work because the full prior assistant response is in the history context.</w:t>
-      </w:r>
-    </w:p>
-    <w:p>
-      <w:pPr>
-        <w:pStyle w:val="Heading2"/>
-      </w:pPr>
-      <w:r>
         <w:t>Real interactions</w:t>
       </w:r>
     </w:p>
@@ -2596,15 +2135,7 @@
     </w:p>
     <w:p>
       <w:r>
-        <w:t>Memories are stored in ~/.doit/</w:t>
-      </w:r>
-      <w:proofErr w:type="spellStart"/>
-      <w:r>
-        <w:t>memory.json</w:t>
-      </w:r>
-      <w:proofErr w:type="spellEnd"/>
-      <w:r>
-        <w:t xml:space="preserve"> as a flat key/value dict. Any </w:t>
+        <w:t xml:space="preserve">Memories are stored in ~/.doit/memory.json as a flat key/value dict. Any </w:t>
       </w:r>
       <w:r>
         <w:t>model's</w:t>
@@ -2686,39 +2217,119 @@
           <w:b/>
           <w:color w:val="005FAF"/>
         </w:rPr>
-        <w:t xml:space="preserve"> doit "store in your memories that </w:t>
-      </w:r>
-      <w:proofErr w:type="spellStart"/>
+        <w:t xml:space="preserve"> doit "store in your memories that project_folder is ~/school/llms/ass3"</w:t>
+      </w:r>
+    </w:p>
+    <w:p>
+      <w:pPr>
+        <w:pStyle w:val="NoSpacing"/>
+        <w:shd w:val="clear" w:color="auto" w:fill="F0F0F0"/>
+      </w:pPr>
+      <w:r>
+        <w:rPr>
+          <w:rFonts w:ascii="Courier New" w:hAnsi="Courier New"/>
+          <w:sz w:val="18"/>
+        </w:rPr>
+        <w:t xml:space="preserve">(no output — LLM returned a memories-only response with no </w:t>
+      </w:r>
+      <w:proofErr w:type="gramStart"/>
+      <w:r>
+        <w:rPr>
+          <w:rFonts w:ascii="Courier New" w:hAnsi="Courier New"/>
+          <w:sz w:val="18"/>
+        </w:rPr>
+        <w:t>type</w:t>
+      </w:r>
+      <w:proofErr w:type="gramEnd"/>
+      <w:r>
+        <w:rPr>
+          <w:rFonts w:ascii="Courier New" w:hAnsi="Courier New"/>
+          <w:sz w:val="18"/>
+        </w:rPr>
+        <w:t xml:space="preserve"> field)</w:t>
+      </w:r>
+    </w:p>
+    <w:p>
+      <w:pPr>
+        <w:pStyle w:val="NoSpacing"/>
+        <w:shd w:val="clear" w:color="auto" w:fill="F0F0F0"/>
+      </w:pPr>
+      <w:r>
+        <w:rPr>
+          <w:rFonts w:ascii="Courier New" w:hAnsi="Courier New"/>
+          <w:sz w:val="18"/>
+        </w:rPr>
+        <w:t xml:space="preserve">Memory </w:t>
+      </w:r>
+      <w:proofErr w:type="gramStart"/>
+      <w:r>
+        <w:rPr>
+          <w:rFonts w:ascii="Courier New" w:hAnsi="Courier New"/>
+          <w:sz w:val="18"/>
+        </w:rPr>
+        <w:t>stored: {</w:t>
+      </w:r>
+      <w:proofErr w:type="gramEnd"/>
+      <w:r>
+        <w:rPr>
+          <w:rFonts w:ascii="Courier New" w:hAnsi="Courier New"/>
+          <w:sz w:val="18"/>
+        </w:rPr>
+        <w:t>"project_folder": "~/school/llms/</w:t>
+      </w:r>
+      <w:proofErr w:type="gramStart"/>
+      <w:r>
+        <w:rPr>
+          <w:rFonts w:ascii="Courier New" w:hAnsi="Courier New"/>
+          <w:sz w:val="18"/>
+        </w:rPr>
+        <w:t>ass3"}</w:t>
+      </w:r>
+      <w:proofErr w:type="gramEnd"/>
+    </w:p>
+    <w:p>
       <w:r>
         <w:rPr>
           <w:b/>
           <w:color w:val="005FAF"/>
         </w:rPr>
-        <w:t>project_folder</w:t>
-      </w:r>
-      <w:proofErr w:type="spellEnd"/>
+        <w:t>(new session) $ doit "</w:t>
+      </w:r>
       <w:r>
         <w:rPr>
           <w:b/>
           <w:color w:val="005FAF"/>
         </w:rPr>
-        <w:t xml:space="preserve"> is ~/school/</w:t>
-      </w:r>
-      <w:proofErr w:type="spellStart"/>
+        <w:t xml:space="preserve">what is </w:t>
+      </w:r>
       <w:r>
         <w:rPr>
           <w:b/>
           <w:color w:val="005FAF"/>
         </w:rPr>
-        <w:t>llms</w:t>
-      </w:r>
-      <w:proofErr w:type="spellEnd"/>
+        <w:t xml:space="preserve">my project folder"  </w:t>
+      </w:r>
+    </w:p>
+    <w:p>
+      <w:pPr>
+        <w:pStyle w:val="NoSpacing"/>
+        <w:shd w:val="clear" w:color="auto" w:fill="F0F0F0"/>
+      </w:pPr>
+      <w:r>
+        <w:rPr>
+          <w:rFonts w:ascii="Courier New" w:hAnsi="Courier New"/>
+          <w:sz w:val="18"/>
+        </w:rPr>
+        <w:t>Your project folder is ~/school/llms/ass3</w:t>
+      </w:r>
+    </w:p>
+    <w:p>
       <w:r>
         <w:rPr>
           <w:b/>
           <w:color w:val="005FAF"/>
         </w:rPr>
-        <w:t>/ass3"</w:t>
+        <w:t>$ doit --memories</w:t>
       </w:r>
     </w:p>
     <w:p>
@@ -2731,23 +2342,7 @@
           <w:rFonts w:ascii="Courier New" w:hAnsi="Courier New"/>
           <w:sz w:val="18"/>
         </w:rPr>
-        <w:t xml:space="preserve">(no output — LLM returned a memories-only response with no </w:t>
-      </w:r>
-      <w:proofErr w:type="gramStart"/>
-      <w:r>
-        <w:rPr>
-          <w:rFonts w:ascii="Courier New" w:hAnsi="Courier New"/>
-          <w:sz w:val="18"/>
-        </w:rPr>
-        <w:t>type</w:t>
-      </w:r>
-      <w:proofErr w:type="gramEnd"/>
-      <w:r>
-        <w:rPr>
-          <w:rFonts w:ascii="Courier New" w:hAnsi="Courier New"/>
-          <w:sz w:val="18"/>
-        </w:rPr>
-        <w:t xml:space="preserve"> field)</w:t>
+        <w:t>Stored memories:</w:t>
       </w:r>
     </w:p>
     <w:p>
@@ -2760,65 +2355,93 @@
           <w:rFonts w:ascii="Courier New" w:hAnsi="Courier New"/>
           <w:sz w:val="18"/>
         </w:rPr>
-        <w:t xml:space="preserve">Memory </w:t>
+        <w:t xml:space="preserve">  project_folder: ~/school/llms/ass3</w:t>
+      </w:r>
+    </w:p>
+    <w:p>
+      <w:pPr>
+        <w:pStyle w:val="Heading2"/>
+      </w:pPr>
+      <w:r>
+        <w:t>Limitations</w:t>
+      </w:r>
+    </w:p>
+    <w:p>
+      <w:r>
+        <w:t>The llama-3.1-8b model often ignores the memories mechanism for natural requests like "remember my name is Nadav"</w:t>
+      </w:r>
+      <w:r>
+        <w:t>.</w:t>
+      </w:r>
+    </w:p>
+    <w:p>
+      <w:r>
+        <w:t xml:space="preserve">A response with only "memories" and no "type" field produces no output but still stores the memory correctly — the user </w:t>
+      </w:r>
+      <w:r>
+        <w:t>will see</w:t>
+      </w:r>
+      <w:r>
+        <w:t xml:space="preserve"> a blank response.</w:t>
+      </w:r>
+    </w:p>
+    <w:p/>
+    <w:p>
+      <w:pPr>
+        <w:pStyle w:val="Heading1"/>
+      </w:pPr>
+      <w:r>
+        <w:lastRenderedPageBreak/>
+        <w:t>Section 8: User Awareness (Shell History)</w:t>
+      </w:r>
+    </w:p>
+    <w:p>
+      <w:pPr>
+        <w:pStyle w:val="Heading2"/>
+      </w:pPr>
+      <w:r>
+        <w:t>What was implemented</w:t>
+      </w:r>
+    </w:p>
+    <w:p>
+      <w:r>
+        <w:t>read_shell_history() reads ~/.bash_history or ~/.zsh_history and returns the last 15 commands. zsh extended</w:t>
+      </w:r>
+      <w:r>
+        <w:t xml:space="preserve"> </w:t>
+      </w:r>
+      <w:r>
+        <w:t xml:space="preserve">history lines are parsed to extract just the command. The list is injected </w:t>
       </w:r>
       <w:proofErr w:type="gramStart"/>
       <w:r>
-        <w:rPr>
-          <w:rFonts w:ascii="Courier New" w:hAnsi="Courier New"/>
-          <w:sz w:val="18"/>
-        </w:rPr>
-        <w:t>stored: {</w:t>
+        <w:t>in</w:t>
       </w:r>
       <w:proofErr w:type="gramEnd"/>
       <w:r>
-        <w:rPr>
-          <w:rFonts w:ascii="Courier New" w:hAnsi="Courier New"/>
-          <w:sz w:val="18"/>
-        </w:rPr>
-        <w:t>"</w:t>
-      </w:r>
-      <w:proofErr w:type="spellStart"/>
-      <w:r>
-        <w:rPr>
-          <w:rFonts w:ascii="Courier New" w:hAnsi="Courier New"/>
-          <w:sz w:val="18"/>
-        </w:rPr>
-        <w:t>project_folder</w:t>
-      </w:r>
-      <w:proofErr w:type="spellEnd"/>
-      <w:r>
-        <w:rPr>
-          <w:rFonts w:ascii="Courier New" w:hAnsi="Courier New"/>
-          <w:sz w:val="18"/>
-        </w:rPr>
-        <w:t>": "~/school/</w:t>
-      </w:r>
-      <w:proofErr w:type="spellStart"/>
-      <w:r>
-        <w:rPr>
-          <w:rFonts w:ascii="Courier New" w:hAnsi="Courier New"/>
-          <w:sz w:val="18"/>
-        </w:rPr>
-        <w:t>llms</w:t>
-      </w:r>
-      <w:proofErr w:type="spellEnd"/>
-      <w:r>
-        <w:rPr>
-          <w:rFonts w:ascii="Courier New" w:hAnsi="Courier New"/>
-          <w:sz w:val="18"/>
-        </w:rPr>
-        <w:t>/</w:t>
+        <w:t xml:space="preserve"> the system message as a separate section, distinct from doit's own conversation history.</w:t>
+      </w:r>
+    </w:p>
+    <w:p>
+      <w:pPr>
+        <w:pStyle w:val="Heading2"/>
+      </w:pPr>
+      <w:r>
+        <w:t>Design decisions</w:t>
+      </w:r>
+    </w:p>
+    <w:p>
+      <w:r>
+        <w:t xml:space="preserve">Two sources of "what happened before" are kept separate on purpose: doit's own commands appear in the </w:t>
       </w:r>
       <w:proofErr w:type="gramStart"/>
       <w:r>
-        <w:rPr>
-          <w:rFonts w:ascii="Courier New" w:hAnsi="Courier New"/>
-          <w:sz w:val="18"/>
-        </w:rPr>
-        <w:t>ass3"}</w:t>
+        <w:t>assistant</w:t>
       </w:r>
       <w:proofErr w:type="gramEnd"/>
+      <w:r>
+        <w:t xml:space="preserve"> turns of the conversation history, while manual shell commands appear only in the system section. The LLM can therefore distinguish "you (doit) ran X" from "the user manually ran Y".</w:t>
+      </w:r>
     </w:p>
     <w:p>
       <w:r>
@@ -2826,21 +2449,32 @@
           <w:b/>
           <w:color w:val="005FAF"/>
         </w:rPr>
-        <w:t>(new session) $ doit "</w:t>
-      </w:r>
+        <w:t xml:space="preserve">User manually </w:t>
+      </w:r>
+      <w:proofErr w:type="gramStart"/>
       <w:r>
         <w:rPr>
           <w:b/>
           <w:color w:val="005FAF"/>
         </w:rPr>
-        <w:t xml:space="preserve">what is </w:t>
-      </w:r>
+        <w:t>ran:</w:t>
+      </w:r>
+      <w:proofErr w:type="gramEnd"/>
       <w:r>
         <w:rPr>
           <w:b/>
           <w:color w:val="005FAF"/>
         </w:rPr>
-        <w:t xml:space="preserve">my project folder"  </w:t>
+        <w:t xml:space="preserve"> cd ~/data &amp;&amp; python train.py --epochs 10</w:t>
+      </w:r>
+    </w:p>
+    <w:p>
+      <w:r>
+        <w:rPr>
+          <w:b/>
+          <w:color w:val="005FAF"/>
+        </w:rPr>
+        <w:t>doit "summarize what I just did"</w:t>
       </w:r>
     </w:p>
     <w:p>
@@ -2853,23 +2487,95 @@
           <w:rFonts w:ascii="Courier New" w:hAnsi="Courier New"/>
           <w:sz w:val="18"/>
         </w:rPr>
-        <w:t>Your project folder is ~/school/</w:t>
-      </w:r>
-      <w:proofErr w:type="spellStart"/>
-      <w:r>
-        <w:rPr>
-          <w:rFonts w:ascii="Courier New" w:hAnsi="Courier New"/>
-          <w:sz w:val="18"/>
-        </w:rPr>
-        <w:t>llms</w:t>
-      </w:r>
-      <w:proofErr w:type="spellEnd"/>
-      <w:r>
-        <w:rPr>
-          <w:rFonts w:ascii="Courier New" w:hAnsi="Courier New"/>
-          <w:sz w:val="18"/>
-        </w:rPr>
-        <w:t>/ass3</w:t>
+        <w:t>You navigated to ~/data and ran a Python training script (train.py) with 10 epochs.</w:t>
+      </w:r>
+    </w:p>
+    <w:p>
+      <w:pPr>
+        <w:pStyle w:val="NoSpacing"/>
+        <w:shd w:val="clear" w:color="auto" w:fill="F0F0F0"/>
+      </w:pPr>
+      <w:r>
+        <w:rPr>
+          <w:rFonts w:ascii="Courier New" w:hAnsi="Courier New"/>
+          <w:sz w:val="18"/>
+        </w:rPr>
+        <w:t>This was a manual action outside of doit.</w:t>
+      </w:r>
+    </w:p>
+    <w:p>
+      <w:pPr>
+        <w:pStyle w:val="Heading2"/>
+      </w:pPr>
+      <w:r>
+        <w:t>Limitations</w:t>
+      </w:r>
+    </w:p>
+    <w:p>
+      <w:r>
+        <w:t>Commands that run after the current doit call are not captured.</w:t>
+      </w:r>
+    </w:p>
+    <w:p>
+      <w:r>
+        <w:t>On Windows the .bash_history path may differ depending on</w:t>
+      </w:r>
+      <w:r>
+        <w:t xml:space="preserve"> </w:t>
+      </w:r>
+      <w:r>
+        <w:t>Git Bash.</w:t>
+      </w:r>
+    </w:p>
+    <w:p/>
+    <w:p>
+      <w:pPr>
+        <w:pStyle w:val="Heading1"/>
+      </w:pPr>
+      <w:r>
+        <w:t>Section 9: Output Awareness</w:t>
+      </w:r>
+    </w:p>
+    <w:p>
+      <w:pPr>
+        <w:pStyle w:val="Heading2"/>
+      </w:pPr>
+      <w:r>
+        <w:t>What was implemented</w:t>
+      </w:r>
+    </w:p>
+    <w:p>
+      <w:r>
+        <w:t>Each history entry stores the full execution result</w:t>
+      </w:r>
+      <w:r>
+        <w:t>(stdout, stderr, returncode)</w:t>
+      </w:r>
+      <w:r>
+        <w:t xml:space="preserve"> . _build_messages() appends this as a "[Execution result]" user message after each assistant turn. The next </w:t>
+      </w:r>
+      <w:r>
+        <w:t>model call</w:t>
+      </w:r>
+      <w:r>
+        <w:t xml:space="preserve"> therefore has full access to</w:t>
+      </w:r>
+      <w:r>
+        <w:t xml:space="preserve"> the output of the</w:t>
+      </w:r>
+      <w:r>
+        <w:t xml:space="preserve"> previous command</w:t>
+      </w:r>
+      <w:r>
+        <w:t>s.</w:t>
+      </w:r>
+    </w:p>
+    <w:p>
+      <w:pPr>
+        <w:pStyle w:val="Heading2"/>
+      </w:pPr>
+      <w:r>
+        <w:t>Real interactions</w:t>
       </w:r>
     </w:p>
     <w:p>
@@ -2878,7 +2584,7 @@
           <w:b/>
           <w:color w:val="005FAF"/>
         </w:rPr>
-        <w:t>$ doit --memories</w:t>
+        <w:t>Turn 1:  doit "show the sizes of all files in this directory"</w:t>
       </w:r>
     </w:p>
     <w:p>
@@ -2891,7 +2597,7 @@
           <w:rFonts w:ascii="Courier New" w:hAnsi="Courier New"/>
           <w:sz w:val="18"/>
         </w:rPr>
-        <w:t>Stored memories:</w:t>
+        <w:t>$ du -h *</w:t>
       </w:r>
     </w:p>
     <w:p>
@@ -2904,153 +2610,20 @@
           <w:rFonts w:ascii="Courier New" w:hAnsi="Courier New"/>
           <w:sz w:val="18"/>
         </w:rPr>
-        <w:t xml:space="preserve">  </w:t>
-      </w:r>
-      <w:proofErr w:type="spellStart"/>
-      <w:r>
-        <w:rPr>
-          <w:rFonts w:ascii="Courier New" w:hAnsi="Courier New"/>
-          <w:sz w:val="18"/>
-        </w:rPr>
-        <w:t>project_folder</w:t>
-      </w:r>
-      <w:proofErr w:type="spellEnd"/>
-      <w:r>
-        <w:rPr>
-          <w:rFonts w:ascii="Courier New" w:hAnsi="Courier New"/>
-          <w:sz w:val="18"/>
-        </w:rPr>
-        <w:t>: ~/school/</w:t>
-      </w:r>
-      <w:proofErr w:type="spellStart"/>
-      <w:r>
-        <w:rPr>
-          <w:rFonts w:ascii="Courier New" w:hAnsi="Courier New"/>
-          <w:sz w:val="18"/>
-        </w:rPr>
-        <w:t>llms</w:t>
-      </w:r>
-      <w:proofErr w:type="spellEnd"/>
-      <w:r>
-        <w:rPr>
-          <w:rFonts w:ascii="Courier New" w:hAnsi="Courier New"/>
-          <w:sz w:val="18"/>
-        </w:rPr>
-        <w:t>/ass3</w:t>
-      </w:r>
-    </w:p>
-    <w:p>
-      <w:pPr>
-        <w:pStyle w:val="Heading2"/>
-      </w:pPr>
-      <w:r>
-        <w:t>Limitations</w:t>
-      </w:r>
-    </w:p>
-    <w:p>
-      <w:r>
-        <w:t>The llama-3.1-8b model often ignores the memories mechanism for natural requests like "remember my name is Nadav"</w:t>
-      </w:r>
-      <w:r>
-        <w:t>.</w:t>
-      </w:r>
-    </w:p>
-    <w:p>
-      <w:r>
-        <w:t xml:space="preserve">A response with only "memories" and no "type" field produces no output but still stores the memory correctly — the user </w:t>
-      </w:r>
-      <w:r>
-        <w:t>will see</w:t>
-      </w:r>
-      <w:r>
-        <w:t xml:space="preserve"> a blank response.</w:t>
-      </w:r>
-    </w:p>
-    <w:p/>
-    <w:p>
-      <w:pPr>
-        <w:pStyle w:val="Heading1"/>
-      </w:pPr>
-      <w:r>
-        <w:lastRenderedPageBreak/>
-        <w:t>Section 8: User Awareness (Shell History)</w:t>
-      </w:r>
-    </w:p>
-    <w:p>
-      <w:pPr>
-        <w:pStyle w:val="Heading2"/>
-      </w:pPr>
-      <w:r>
-        <w:t>What was implemented</w:t>
-      </w:r>
-    </w:p>
-    <w:p>
-      <w:proofErr w:type="spellStart"/>
-      <w:r>
-        <w:t>read_shell_history</w:t>
-      </w:r>
-      <w:proofErr w:type="spellEnd"/>
-      <w:r>
-        <w:t>() reads ~/.</w:t>
-      </w:r>
-      <w:proofErr w:type="spellStart"/>
-      <w:r>
-        <w:t>bash_history</w:t>
-      </w:r>
-      <w:proofErr w:type="spellEnd"/>
-      <w:r>
-        <w:t xml:space="preserve"> or ~/.</w:t>
-      </w:r>
-      <w:proofErr w:type="spellStart"/>
-      <w:r>
-        <w:t>zsh_history</w:t>
-      </w:r>
-      <w:proofErr w:type="spellEnd"/>
-      <w:r>
-        <w:t xml:space="preserve"> and returns the last 15 commands. </w:t>
-      </w:r>
-      <w:proofErr w:type="spellStart"/>
-      <w:r>
-        <w:t>zsh</w:t>
-      </w:r>
-      <w:proofErr w:type="spellEnd"/>
-      <w:r>
-        <w:t xml:space="preserve"> extended</w:t>
-      </w:r>
-      <w:r>
-        <w:t xml:space="preserve"> </w:t>
-      </w:r>
-      <w:r>
-        <w:t xml:space="preserve">history lines are parsed to extract just the command. The list is injected </w:t>
-      </w:r>
-      <w:proofErr w:type="gramStart"/>
-      <w:r>
-        <w:t>in</w:t>
-      </w:r>
-      <w:proofErr w:type="gramEnd"/>
-      <w:r>
-        <w:t xml:space="preserve"> the system message as a separate section, distinct from doit's own conversation history.</w:t>
-      </w:r>
-    </w:p>
-    <w:p>
-      <w:pPr>
-        <w:pStyle w:val="Heading2"/>
-      </w:pPr>
-      <w:r>
-        <w:t>Design decisions</w:t>
-      </w:r>
-    </w:p>
-    <w:p>
-      <w:r>
-        <w:t xml:space="preserve">Two sources of "what happened before" are kept separate on purpose: doit's own commands appear in the </w:t>
-      </w:r>
-      <w:proofErr w:type="gramStart"/>
-      <w:r>
-        <w:t>assistant</w:t>
-      </w:r>
-      <w:proofErr w:type="gramEnd"/>
-      <w:r>
-        <w:t xml:space="preserve"> turns of the conversation history, while manual shell commands appear only in the system section. The LLM can therefore distinguish "you (doit) ran X" from "the user manually ran Y".</w:t>
+        <w:t xml:space="preserve">  -&gt; Print the sizes of all files in the current directory</w:t>
+      </w:r>
+    </w:p>
+    <w:p>
+      <w:pPr>
+        <w:pStyle w:val="NoSpacing"/>
+        <w:shd w:val="clear" w:color="auto" w:fill="F0F0F0"/>
+      </w:pPr>
+      <w:r>
+        <w:rPr>
+          <w:rFonts w:ascii="Courier New" w:hAnsi="Courier New"/>
+          <w:sz w:val="18"/>
+        </w:rPr>
+        <w:t xml:space="preserve">[exit 126]  &lt;- command failed </w:t>
       </w:r>
     </w:p>
     <w:p>
@@ -3059,32 +2632,124 @@
           <w:b/>
           <w:color w:val="005FAF"/>
         </w:rPr>
-        <w:t xml:space="preserve">User manually </w:t>
-      </w:r>
-      <w:proofErr w:type="gramStart"/>
+        <w:t>Turn 2: $ doit "why did that command fail?"</w:t>
+      </w:r>
+    </w:p>
+    <w:p>
+      <w:pPr>
+        <w:pStyle w:val="NoSpacing"/>
+        <w:shd w:val="clear" w:color="auto" w:fill="F0F0F0"/>
+      </w:pPr>
+      <w:r>
+        <w:rPr>
+          <w:rFonts w:ascii="Courier New" w:hAnsi="Courier New"/>
+          <w:sz w:val="18"/>
+        </w:rPr>
+        <w:t>The command failed because it encountered a directory that it couldn't access, and it returned a non-zero exit code (512). This is likely due to the presence of the `.no_exist` directories in the output, which suggests that the command was trying to access non-existent files or directories</w:t>
+      </w:r>
+      <w:r>
+        <w:rPr>
+          <w:rFonts w:ascii="Courier New" w:hAnsi="Courier New"/>
+          <w:sz w:val="18"/>
+        </w:rPr>
+        <w:t>.</w:t>
+      </w:r>
+    </w:p>
+    <w:p>
+      <w:r>
+        <w:lastRenderedPageBreak/>
+        <w:t>The LLM correctly diagnosed the failure by reading the stderr and returncode from the previous execution result in context.</w:t>
+      </w:r>
+    </w:p>
+    <w:p>
+      <w:pPr>
+        <w:pStyle w:val="Heading2"/>
+      </w:pPr>
+      <w:r>
+        <w:t>Limitations</w:t>
+      </w:r>
+    </w:p>
+    <w:p>
+      <w:pPr>
+        <w:pStyle w:val="Heading2"/>
+      </w:pPr>
+      <w:r>
+        <w:t>Recovery interaction</w:t>
+      </w:r>
+    </w:p>
+    <w:p>
+      <w:r>
+        <w:t>Because execution output is stored in history, the llm can diagnose failures and recover across turns without the user repeating context:</w:t>
+      </w:r>
+    </w:p>
+    <w:p>
       <w:r>
         <w:rPr>
           <w:b/>
           <w:color w:val="005FAF"/>
         </w:rPr>
-        <w:t>ran:</w:t>
-      </w:r>
-      <w:proofErr w:type="gramEnd"/>
+        <w:t>Turn 1: doit "show the last 5 lines of output.log"</w:t>
+      </w:r>
+    </w:p>
+    <w:p>
+      <w:pPr>
+        <w:pStyle w:val="NoSpacing"/>
+        <w:shd w:val="clear" w:color="auto" w:fill="F0F0F0"/>
+      </w:pPr>
+      <w:r>
+        <w:rPr>
+          <w:rFonts w:ascii="Courier New" w:hAnsi="Courier New"/>
+          <w:sz w:val="18"/>
+        </w:rPr>
+        <w:t>$ tail -n 5 output.log</w:t>
+      </w:r>
+    </w:p>
+    <w:p>
+      <w:pPr>
+        <w:pStyle w:val="NoSpacing"/>
+        <w:shd w:val="clear" w:color="auto" w:fill="F0F0F0"/>
+      </w:pPr>
+      <w:r>
+        <w:rPr>
+          <w:rFonts w:ascii="Courier New" w:hAnsi="Courier New"/>
+          <w:sz w:val="18"/>
+        </w:rPr>
+        <w:t xml:space="preserve">  -&gt; Show the last 5 lines of output.log</w:t>
+      </w:r>
+    </w:p>
+    <w:p>
+      <w:pPr>
+        <w:pStyle w:val="NoSpacing"/>
+        <w:shd w:val="clear" w:color="auto" w:fill="F0F0F0"/>
+      </w:pPr>
+      <w:r>
+        <w:rPr>
+          <w:rFonts w:ascii="Courier New" w:hAnsi="Courier New"/>
+          <w:sz w:val="18"/>
+        </w:rPr>
+        <w:t>tail: cannot open 'output.log' for reading: No such file or directory</w:t>
+      </w:r>
+    </w:p>
+    <w:p>
+      <w:pPr>
+        <w:pStyle w:val="NoSpacing"/>
+        <w:shd w:val="clear" w:color="auto" w:fill="F0F0F0"/>
+      </w:pPr>
+      <w:r>
+        <w:rPr>
+          <w:rFonts w:ascii="Courier New" w:hAnsi="Courier New"/>
+          <w:sz w:val="18"/>
+        </w:rPr>
+        <w:t>[exit 1]</w:t>
+      </w:r>
+    </w:p>
+    <w:p>
       <w:r>
         <w:rPr>
           <w:b/>
           <w:color w:val="005FAF"/>
         </w:rPr>
-        <w:t xml:space="preserve"> cd ~/data &amp;&amp; python train.py --epochs 10</w:t>
-      </w:r>
-    </w:p>
-    <w:p>
-      <w:r>
-        <w:rPr>
-          <w:b/>
-          <w:color w:val="005FAF"/>
-        </w:rPr>
-        <w:t>doit "summarize what I just did"</w:t>
+        <w:t>Turn 2: doit "that file doesn't exist, show the last 5 lines of the doit file instead"</w:t>
       </w:r>
     </w:p>
     <w:p>
@@ -3097,7 +2762,7 @@
           <w:rFonts w:ascii="Courier New" w:hAnsi="Courier New"/>
           <w:sz w:val="18"/>
         </w:rPr>
-        <w:t>You navigated to ~/data and ran a Python training script (train.py) with 10 epochs.</w:t>
+        <w:t>$ tail -n 5 doit</w:t>
       </w:r>
     </w:p>
     <w:p>
@@ -3110,123 +2775,7 @@
           <w:rFonts w:ascii="Courier New" w:hAnsi="Courier New"/>
           <w:sz w:val="18"/>
         </w:rPr>
-        <w:t>This was a manual action outside of doit.</w:t>
-      </w:r>
-    </w:p>
-    <w:p>
-      <w:pPr>
-        <w:pStyle w:val="Heading2"/>
-      </w:pPr>
-      <w:r>
-        <w:t>Limitations</w:t>
-      </w:r>
-    </w:p>
-    <w:p>
-      <w:r>
-        <w:t>Commands that run after the current doit call are not captured.</w:t>
-      </w:r>
-    </w:p>
-    <w:p>
-      <w:r>
-        <w:t>On Windows the .</w:t>
-      </w:r>
-      <w:proofErr w:type="spellStart"/>
-      <w:r>
-        <w:t>bash_history</w:t>
-      </w:r>
-      <w:proofErr w:type="spellEnd"/>
-      <w:r>
-        <w:t xml:space="preserve"> path may differ depending on</w:t>
-      </w:r>
-      <w:r>
-        <w:t xml:space="preserve"> </w:t>
-      </w:r>
-      <w:r>
-        <w:t>Git Bash.</w:t>
-      </w:r>
-    </w:p>
-    <w:p/>
-    <w:p>
-      <w:pPr>
-        <w:pStyle w:val="Heading1"/>
-      </w:pPr>
-      <w:r>
-        <w:t>Section 9: Output Awareness</w:t>
-      </w:r>
-    </w:p>
-    <w:p>
-      <w:pPr>
-        <w:pStyle w:val="Heading2"/>
-      </w:pPr>
-      <w:r>
-        <w:t>What was implemented</w:t>
-      </w:r>
-    </w:p>
-    <w:p>
-      <w:r>
-        <w:t>Each history entry stores the full execution result</w:t>
-      </w:r>
-      <w:r>
-        <w:t>(</w:t>
-      </w:r>
-      <w:proofErr w:type="spellStart"/>
-      <w:r>
-        <w:t>stdout</w:t>
-      </w:r>
-      <w:proofErr w:type="spellEnd"/>
-      <w:r>
-        <w:t xml:space="preserve">, stderr, </w:t>
-      </w:r>
-      <w:proofErr w:type="spellStart"/>
-      <w:r>
-        <w:t>returncode</w:t>
-      </w:r>
-      <w:proofErr w:type="spellEnd"/>
-      <w:r>
-        <w:t>)</w:t>
-      </w:r>
-      <w:r>
-        <w:t xml:space="preserve"> . _</w:t>
-      </w:r>
-      <w:proofErr w:type="spellStart"/>
-      <w:r>
-        <w:t>build_messages</w:t>
-      </w:r>
-      <w:proofErr w:type="spellEnd"/>
-      <w:r>
-        <w:t xml:space="preserve">() appends this as a "[Execution result]" user message after each assistant turn. The next </w:t>
-      </w:r>
-      <w:r>
-        <w:t>model call</w:t>
-      </w:r>
-      <w:r>
-        <w:t xml:space="preserve"> therefore has full access to</w:t>
-      </w:r>
-      <w:r>
-        <w:t xml:space="preserve"> the output of the</w:t>
-      </w:r>
-      <w:r>
-        <w:t xml:space="preserve"> previous command</w:t>
-      </w:r>
-      <w:r>
-        <w:t>s.</w:t>
-      </w:r>
-    </w:p>
-    <w:p>
-      <w:pPr>
-        <w:pStyle w:val="Heading2"/>
-      </w:pPr>
-      <w:r>
-        <w:t>Real interactions</w:t>
-      </w:r>
-    </w:p>
-    <w:p>
-      <w:r>
-        <w:rPr>
-          <w:b/>
-          <w:color w:val="005FAF"/>
-        </w:rPr>
-        <w:t>Turn 1:  doit "show the sizes of all files in this directory"</w:t>
+        <w:t xml:space="preserve">  -&gt; Show the last 5 lines of the file called 'doit' in the current directory</w:t>
       </w:r>
     </w:p>
     <w:p>
@@ -3239,7 +2788,7 @@
           <w:rFonts w:ascii="Courier New" w:hAnsi="Courier New"/>
           <w:sz w:val="18"/>
         </w:rPr>
-        <w:t>$ du -h *</w:t>
+        <w:t xml:space="preserve">    save_history(history)</w:t>
       </w:r>
     </w:p>
     <w:p>
@@ -3252,7 +2801,7 @@
           <w:rFonts w:ascii="Courier New" w:hAnsi="Courier New"/>
           <w:sz w:val="18"/>
         </w:rPr>
-        <w:t xml:space="preserve">  -&gt; Print the sizes of all files in the current directory</w:t>
+        <w:t xml:space="preserve"> </w:t>
       </w:r>
     </w:p>
     <w:p>
@@ -3265,16 +2814,7 @@
           <w:rFonts w:ascii="Courier New" w:hAnsi="Courier New"/>
           <w:sz w:val="18"/>
         </w:rPr>
-        <w:t xml:space="preserve">[exit 126]  &lt;- command failed </w:t>
-      </w:r>
-    </w:p>
-    <w:p>
-      <w:r>
-        <w:rPr>
-          <w:b/>
-          <w:color w:val="005FAF"/>
-        </w:rPr>
-        <w:t>Turn 2: $ doit "why did that command fail?"</w:t>
+        <w:t xml:space="preserve"> </w:t>
       </w:r>
     </w:p>
     <w:p>
@@ -3287,74 +2827,7 @@
           <w:rFonts w:ascii="Courier New" w:hAnsi="Courier New"/>
           <w:sz w:val="18"/>
         </w:rPr>
-        <w:t>The command failed because it encountered a directory that it couldn't access, and it returned a non-zero exit code (512). This is likely due to the presence of the `.</w:t>
-      </w:r>
-      <w:proofErr w:type="spellStart"/>
-      <w:r>
-        <w:rPr>
-          <w:rFonts w:ascii="Courier New" w:hAnsi="Courier New"/>
-          <w:sz w:val="18"/>
-        </w:rPr>
-        <w:t>no_exist</w:t>
-      </w:r>
-      <w:proofErr w:type="spellEnd"/>
-      <w:r>
-        <w:rPr>
-          <w:rFonts w:ascii="Courier New" w:hAnsi="Courier New"/>
-          <w:sz w:val="18"/>
-        </w:rPr>
-        <w:t>` directories in the output, which suggests that the command was trying to access non-existent files or directories</w:t>
-      </w:r>
-      <w:r>
-        <w:rPr>
-          <w:rFonts w:ascii="Courier New" w:hAnsi="Courier New"/>
-          <w:sz w:val="18"/>
-        </w:rPr>
-        <w:t>.</w:t>
-      </w:r>
-    </w:p>
-    <w:p>
-      <w:r>
-        <w:lastRenderedPageBreak/>
-        <w:t xml:space="preserve">The LLM correctly diagnosed the failure by reading the stderr and </w:t>
-      </w:r>
-      <w:proofErr w:type="spellStart"/>
-      <w:r>
-        <w:t>returncode</w:t>
-      </w:r>
-      <w:proofErr w:type="spellEnd"/>
-      <w:r>
-        <w:t xml:space="preserve"> from the previous execution result in context.</w:t>
-      </w:r>
-    </w:p>
-    <w:p>
-      <w:pPr>
-        <w:pStyle w:val="Heading2"/>
-      </w:pPr>
-      <w:r>
-        <w:t>Limitations</w:t>
-      </w:r>
-    </w:p>
-    <w:p>
-      <w:pPr>
-        <w:pStyle w:val="Heading2"/>
-      </w:pPr>
-      <w:r>
-        <w:t>Recovery interaction</w:t>
-      </w:r>
-    </w:p>
-    <w:p>
-      <w:r>
-        <w:t>Because execution output is stored in history, the llm can diagnose failures and recover across turns without the user repeating context:</w:t>
-      </w:r>
-    </w:p>
-    <w:p>
-      <w:r>
-        <w:rPr>
-          <w:b/>
-          <w:color w:val="005FAF"/>
-        </w:rPr>
-        <w:t>Turn 1: doit "show the last 5 lines of output.log"</w:t>
+        <w:t>if __name__ == "__main__":</w:t>
       </w:r>
     </w:p>
     <w:p>
@@ -3367,145 +2840,6 @@
           <w:rFonts w:ascii="Courier New" w:hAnsi="Courier New"/>
           <w:sz w:val="18"/>
         </w:rPr>
-        <w:t>$ tail -n 5 output.log</w:t>
-      </w:r>
-    </w:p>
-    <w:p>
-      <w:pPr>
-        <w:pStyle w:val="NoSpacing"/>
-        <w:shd w:val="clear" w:color="auto" w:fill="F0F0F0"/>
-      </w:pPr>
-      <w:r>
-        <w:rPr>
-          <w:rFonts w:ascii="Courier New" w:hAnsi="Courier New"/>
-          <w:sz w:val="18"/>
-        </w:rPr>
-        <w:t xml:space="preserve">  -&gt; Show the last 5 lines of output.log</w:t>
-      </w:r>
-    </w:p>
-    <w:p>
-      <w:pPr>
-        <w:pStyle w:val="NoSpacing"/>
-        <w:shd w:val="clear" w:color="auto" w:fill="F0F0F0"/>
-      </w:pPr>
-      <w:r>
-        <w:rPr>
-          <w:rFonts w:ascii="Courier New" w:hAnsi="Courier New"/>
-          <w:sz w:val="18"/>
-        </w:rPr>
-        <w:t>tail: cannot open 'output.log' for reading: No such file or directory</w:t>
-      </w:r>
-    </w:p>
-    <w:p>
-      <w:pPr>
-        <w:pStyle w:val="NoSpacing"/>
-        <w:shd w:val="clear" w:color="auto" w:fill="F0F0F0"/>
-      </w:pPr>
-      <w:r>
-        <w:rPr>
-          <w:rFonts w:ascii="Courier New" w:hAnsi="Courier New"/>
-          <w:sz w:val="18"/>
-        </w:rPr>
-        <w:t>[exit 1]</w:t>
-      </w:r>
-    </w:p>
-    <w:p>
-      <w:r>
-        <w:rPr>
-          <w:b/>
-          <w:color w:val="005FAF"/>
-        </w:rPr>
-        <w:t>Turn 2: doit "that file doesn't exist, show the last 5 lines of the doit file instead"</w:t>
-      </w:r>
-    </w:p>
-    <w:p>
-      <w:pPr>
-        <w:pStyle w:val="NoSpacing"/>
-        <w:shd w:val="clear" w:color="auto" w:fill="F0F0F0"/>
-      </w:pPr>
-      <w:r>
-        <w:rPr>
-          <w:rFonts w:ascii="Courier New" w:hAnsi="Courier New"/>
-          <w:sz w:val="18"/>
-        </w:rPr>
-        <w:t>$ tail -n 5 doit</w:t>
-      </w:r>
-    </w:p>
-    <w:p>
-      <w:pPr>
-        <w:pStyle w:val="NoSpacing"/>
-        <w:shd w:val="clear" w:color="auto" w:fill="F0F0F0"/>
-      </w:pPr>
-      <w:r>
-        <w:rPr>
-          <w:rFonts w:ascii="Courier New" w:hAnsi="Courier New"/>
-          <w:sz w:val="18"/>
-        </w:rPr>
-        <w:t xml:space="preserve">  -&gt; Show the last 5 lines of the file called 'doit' in the current directory</w:t>
-      </w:r>
-    </w:p>
-    <w:p>
-      <w:pPr>
-        <w:pStyle w:val="NoSpacing"/>
-        <w:shd w:val="clear" w:color="auto" w:fill="F0F0F0"/>
-      </w:pPr>
-      <w:r>
-        <w:rPr>
-          <w:rFonts w:ascii="Courier New" w:hAnsi="Courier New"/>
-          <w:sz w:val="18"/>
-        </w:rPr>
-        <w:t xml:space="preserve">    save_history(history)</w:t>
-      </w:r>
-    </w:p>
-    <w:p>
-      <w:pPr>
-        <w:pStyle w:val="NoSpacing"/>
-        <w:shd w:val="clear" w:color="auto" w:fill="F0F0F0"/>
-      </w:pPr>
-      <w:r>
-        <w:rPr>
-          <w:rFonts w:ascii="Courier New" w:hAnsi="Courier New"/>
-          <w:sz w:val="18"/>
-        </w:rPr>
-        <w:t xml:space="preserve"> </w:t>
-      </w:r>
-    </w:p>
-    <w:p>
-      <w:pPr>
-        <w:pStyle w:val="NoSpacing"/>
-        <w:shd w:val="clear" w:color="auto" w:fill="F0F0F0"/>
-      </w:pPr>
-      <w:r>
-        <w:rPr>
-          <w:rFonts w:ascii="Courier New" w:hAnsi="Courier New"/>
-          <w:sz w:val="18"/>
-        </w:rPr>
-        <w:t xml:space="preserve"> </w:t>
-      </w:r>
-    </w:p>
-    <w:p>
-      <w:pPr>
-        <w:pStyle w:val="NoSpacing"/>
-        <w:shd w:val="clear" w:color="auto" w:fill="F0F0F0"/>
-      </w:pPr>
-      <w:r>
-        <w:rPr>
-          <w:rFonts w:ascii="Courier New" w:hAnsi="Courier New"/>
-          <w:sz w:val="18"/>
-        </w:rPr>
-        <w:t>if __name__ == "__main__":</w:t>
-      </w:r>
-    </w:p>
-    <w:p>
-      <w:pPr>
-        <w:pStyle w:val="NoSpacing"/>
-        <w:shd w:val="clear" w:color="auto" w:fill="F0F0F0"/>
-      </w:pPr>
-      <w:r>
-        <w:rPr>
-          <w:rFonts w:ascii="Courier New" w:hAnsi="Courier New"/>
-          <w:sz w:val="18"/>
-        </w:rPr>
         <w:t xml:space="preserve">    main()</w:t>
       </w:r>
     </w:p>
@@ -3516,15 +2850,7 @@
     </w:p>
     <w:p>
       <w:r>
-        <w:t xml:space="preserve">a very large </w:t>
-      </w:r>
-      <w:proofErr w:type="spellStart"/>
-      <w:r>
-        <w:t>stdout</w:t>
-      </w:r>
-      <w:proofErr w:type="spellEnd"/>
-      <w:r>
-        <w:t xml:space="preserve"> can inflate the context significantly.</w:t>
+        <w:t>a very large stdout can inflate the context significantly.</w:t>
       </w:r>
     </w:p>
     <w:p/>
@@ -3764,39 +3090,24 @@
       <w:pPr>
         <w:pStyle w:val="ListBullet"/>
       </w:pPr>
-      <w:proofErr w:type="spellStart"/>
-      <w:r>
-        <w:t>agentic_step</w:t>
-      </w:r>
-      <w:proofErr w:type="spellEnd"/>
-      <w:r>
-        <w:t xml:space="preserve"> — run a command, observe output, continue</w:t>
+      <w:r>
+        <w:t>agentic_step — run a command, observe output, continue</w:t>
       </w:r>
     </w:p>
     <w:p>
       <w:pPr>
         <w:pStyle w:val="ListBullet"/>
       </w:pPr>
-      <w:proofErr w:type="spellStart"/>
-      <w:r>
-        <w:t>agentic_done</w:t>
-      </w:r>
-      <w:proofErr w:type="spellEnd"/>
-      <w:r>
-        <w:t xml:space="preserve"> — goal reached, stop</w:t>
+      <w:r>
+        <w:t>agentic_done — goal reached, stop</w:t>
       </w:r>
     </w:p>
     <w:p>
       <w:pPr>
         <w:pStyle w:val="ListBullet"/>
       </w:pPr>
-      <w:proofErr w:type="spellStart"/>
-      <w:r>
-        <w:t>agentic_ask</w:t>
-      </w:r>
-      <w:proofErr w:type="spellEnd"/>
-      <w:r>
-        <w:t xml:space="preserve"> — ask the user a question, then continue</w:t>
+      <w:r>
+        <w:t>agentic_ask — ask the user a question, then continue</w:t>
       </w:r>
     </w:p>
     <w:p>
@@ -4521,21 +3832,8 @@
           </w:tcPr>
           <w:p>
             <w:r>
-              <w:t xml:space="preserve">SYSTEM_PROMPT + </w:t>
+              <w:t>SYSTEM_PROMPT + cwd + shell + session_id</w:t>
             </w:r>
-            <w:proofErr w:type="spellStart"/>
-            <w:r>
-              <w:t>cwd</w:t>
-            </w:r>
-            <w:proofErr w:type="spellEnd"/>
-            <w:r>
-              <w:t xml:space="preserve"> + shell + </w:t>
-            </w:r>
-            <w:proofErr w:type="spellStart"/>
-            <w:r>
-              <w:t>session_id</w:t>
-            </w:r>
-            <w:proofErr w:type="spellEnd"/>
           </w:p>
         </w:tc>
         <w:tc>
@@ -4561,13 +3859,8 @@
           </w:tcPr>
           <w:p>
             <w:r>
-              <w:t xml:space="preserve">V2 — dangerous </w:t>
+              <w:t>V2 — dangerous cmds</w:t>
             </w:r>
-            <w:proofErr w:type="spellStart"/>
-            <w:r>
-              <w:t>cmds</w:t>
-            </w:r>
-            <w:proofErr w:type="spellEnd"/>
           </w:p>
         </w:tc>
         <w:tc>
@@ -4651,23 +3944,7 @@
           </w:tcPr>
           <w:p>
             <w:r>
-              <w:t xml:space="preserve">+ </w:t>
-            </w:r>
-            <w:proofErr w:type="spellStart"/>
-            <w:r>
-              <w:t>sys.memory</w:t>
-            </w:r>
-            <w:proofErr w:type="spellEnd"/>
-            <w:r>
-              <w:t xml:space="preserve"> + </w:t>
-            </w:r>
-            <w:proofErr w:type="spellStart"/>
-            <w:r>
-              <w:t>env.shell_history</w:t>
-            </w:r>
-            <w:proofErr w:type="spellEnd"/>
-            <w:r>
-              <w:t xml:space="preserve"> in system block</w:t>
+              <w:t>+ sys.memory + env.shell_history in system block</w:t>
             </w:r>
           </w:p>
         </w:tc>
@@ -4704,15 +3981,7 @@
           </w:tcPr>
           <w:p>
             <w:r>
-              <w:t xml:space="preserve">AGENTIC_SYSTEM + goal + growing </w:t>
-            </w:r>
-            <w:proofErr w:type="spellStart"/>
-            <w:r>
-              <w:t>substep</w:t>
-            </w:r>
-            <w:proofErr w:type="spellEnd"/>
-            <w:r>
-              <w:t xml:space="preserve"> history</w:t>
+              <w:t>AGENTIC_SYSTEM + goal + growing substep history</w:t>
             </w:r>
           </w:p>
         </w:tc>
@@ -4721,14 +3990,9 @@
             <w:tcW w:w="2880" w:type="dxa"/>
           </w:tcPr>
           <w:p>
-            <w:proofErr w:type="spellStart"/>
             <w:proofErr w:type="gramStart"/>
             <w:r>
-              <w:t>DoitAgentic</w:t>
-            </w:r>
-            <w:proofErr w:type="spellEnd"/>
-            <w:r>
-              <w:t>[@T, @</w:t>
+              <w:t>DoitAgentic[@T, @</w:t>
             </w:r>
             <w:proofErr w:type="gramEnd"/>
             <w:r>
@@ -4852,39 +4116,7 @@
           <w:rFonts w:ascii="Courier New" w:hAnsi="Courier New"/>
           <w:sz w:val="18"/>
         </w:rPr>
-        <w:t>"</w:t>
-      </w:r>
-      <w:proofErr w:type="spellStart"/>
-      <w:r>
-        <w:rPr>
-          <w:rFonts w:ascii="Courier New" w:hAnsi="Courier New"/>
-          <w:sz w:val="18"/>
-        </w:rPr>
-        <w:t>type":"command","command</w:t>
-      </w:r>
-      <w:proofErr w:type="spellEnd"/>
-      <w:r>
-        <w:rPr>
-          <w:rFonts w:ascii="Courier New" w:hAnsi="Courier New"/>
-          <w:sz w:val="18"/>
-        </w:rPr>
-        <w:t>":"&lt;bash command&gt;","description":"&lt;what it does&gt;","</w:t>
-      </w:r>
-      <w:proofErr w:type="spellStart"/>
-      <w:r>
-        <w:rPr>
-          <w:rFonts w:ascii="Courier New" w:hAnsi="Courier New"/>
-          <w:sz w:val="18"/>
-        </w:rPr>
-        <w:t>dangerous":false</w:t>
-      </w:r>
-      <w:proofErr w:type="spellEnd"/>
-      <w:r>
-        <w:rPr>
-          <w:rFonts w:ascii="Courier New" w:hAnsi="Courier New"/>
-          <w:sz w:val="18"/>
-        </w:rPr>
-        <w:t>}</w:t>
+        <w:t>"type":"command","command":"&lt;bash command&gt;","description":"&lt;what it does&gt;","dangerous":false}</w:t>
       </w:r>
     </w:p>
     <w:p>
@@ -4906,39 +4138,7 @@
           <w:rFonts w:ascii="Courier New" w:hAnsi="Courier New"/>
           <w:sz w:val="18"/>
         </w:rPr>
-        <w:t>"</w:t>
-      </w:r>
-      <w:proofErr w:type="spellStart"/>
-      <w:r>
-        <w:rPr>
-          <w:rFonts w:ascii="Courier New" w:hAnsi="Courier New"/>
-          <w:sz w:val="18"/>
-        </w:rPr>
-        <w:t>type":"command","command</w:t>
-      </w:r>
-      <w:proofErr w:type="spellEnd"/>
-      <w:r>
-        <w:rPr>
-          <w:rFonts w:ascii="Courier New" w:hAnsi="Courier New"/>
-          <w:sz w:val="18"/>
-        </w:rPr>
-        <w:t>":"&lt;bash command&gt;","description":"&lt;what it does&gt;","</w:t>
-      </w:r>
-      <w:proofErr w:type="spellStart"/>
-      <w:r>
-        <w:rPr>
-          <w:rFonts w:ascii="Courier New" w:hAnsi="Courier New"/>
-          <w:sz w:val="18"/>
-        </w:rPr>
-        <w:t>dangerous":true</w:t>
-      </w:r>
-      <w:proofErr w:type="spellEnd"/>
-      <w:r>
-        <w:rPr>
-          <w:rFonts w:ascii="Courier New" w:hAnsi="Courier New"/>
-          <w:sz w:val="18"/>
-        </w:rPr>
-        <w:t>}</w:t>
+        <w:t>"type":"command","command":"&lt;bash command&gt;","description":"&lt;what it does&gt;","dangerous":true}</w:t>
       </w:r>
     </w:p>
     <w:p>
@@ -4960,23 +4160,7 @@
           <w:rFonts w:ascii="Courier New" w:hAnsi="Courier New"/>
           <w:sz w:val="18"/>
         </w:rPr>
-        <w:t>"</w:t>
-      </w:r>
-      <w:proofErr w:type="spellStart"/>
-      <w:r>
-        <w:rPr>
-          <w:rFonts w:ascii="Courier New" w:hAnsi="Courier New"/>
-          <w:sz w:val="18"/>
-        </w:rPr>
-        <w:t>type":"answer","text</w:t>
-      </w:r>
-      <w:proofErr w:type="spellEnd"/>
-      <w:r>
-        <w:rPr>
-          <w:rFonts w:ascii="Courier New" w:hAnsi="Courier New"/>
-          <w:sz w:val="18"/>
-        </w:rPr>
-        <w:t>":"&lt;your explanation</w:t>
+        <w:t>"type":"answer","text":"&lt;your explanation</w:t>
       </w:r>
       <w:proofErr w:type="gramStart"/>
       <w:r>
@@ -5007,23 +4191,7 @@
           <w:rFonts w:ascii="Courier New" w:hAnsi="Courier New"/>
           <w:sz w:val="18"/>
         </w:rPr>
-        <w:t>"</w:t>
-      </w:r>
-      <w:proofErr w:type="spellStart"/>
-      <w:r>
-        <w:rPr>
-          <w:rFonts w:ascii="Courier New" w:hAnsi="Courier New"/>
-          <w:sz w:val="18"/>
-        </w:rPr>
-        <w:t>type":"impossible","text</w:t>
-      </w:r>
-      <w:proofErr w:type="spellEnd"/>
-      <w:r>
-        <w:rPr>
-          <w:rFonts w:ascii="Courier New" w:hAnsi="Courier New"/>
-          <w:sz w:val="18"/>
-        </w:rPr>
-        <w:t>":"&lt;reason</w:t>
+        <w:t>"type":"impossible","text":"&lt;reason</w:t>
       </w:r>
       <w:proofErr w:type="gramStart"/>
       <w:r>
@@ -5054,23 +4222,7 @@
           <w:rFonts w:ascii="Courier New" w:hAnsi="Courier New"/>
           <w:sz w:val="18"/>
         </w:rPr>
-        <w:t>"</w:t>
-      </w:r>
-      <w:proofErr w:type="spellStart"/>
-      <w:r>
-        <w:rPr>
-          <w:rFonts w:ascii="Courier New" w:hAnsi="Courier New"/>
-          <w:sz w:val="18"/>
-        </w:rPr>
-        <w:t>type":"clarification","question</w:t>
-      </w:r>
-      <w:proofErr w:type="spellEnd"/>
-      <w:r>
-        <w:rPr>
-          <w:rFonts w:ascii="Courier New" w:hAnsi="Courier New"/>
-          <w:sz w:val="18"/>
-        </w:rPr>
-        <w:t>":"&lt;your question&gt;","options":["opt1","opt2</w:t>
+        <w:t>"type":"clarification","question":"&lt;your question&gt;","options":["opt1","opt2</w:t>
       </w:r>
       <w:proofErr w:type="gramStart"/>
       <w:r>
@@ -5152,23 +4304,7 @@
           <w:rFonts w:ascii="Courier New" w:hAnsi="Courier New"/>
           <w:sz w:val="18"/>
         </w:rPr>
-        <w:t>Any type may include: "memories":[{"</w:t>
-      </w:r>
-      <w:proofErr w:type="spellStart"/>
-      <w:r>
-        <w:rPr>
-          <w:rFonts w:ascii="Courier New" w:hAnsi="Courier New"/>
-          <w:sz w:val="18"/>
-        </w:rPr>
-        <w:t>key":"preferred_editor","value":"vim</w:t>
-      </w:r>
-      <w:proofErr w:type="spellEnd"/>
-      <w:r>
-        <w:rPr>
-          <w:rFonts w:ascii="Courier New" w:hAnsi="Courier New"/>
-          <w:sz w:val="18"/>
-        </w:rPr>
-        <w:t>"}]</w:t>
+        <w:t>Any type may include: "memories":[{"key":"preferred_editor","value":"vim"}]</w:t>
       </w:r>
     </w:p>
     <w:p>
@@ -5197,23 +4333,7 @@
           <w:rFonts w:ascii="Courier New" w:hAnsi="Courier New"/>
           <w:sz w:val="18"/>
         </w:rPr>
-        <w:t>"</w:t>
-      </w:r>
-      <w:proofErr w:type="spellStart"/>
-      <w:r>
-        <w:rPr>
-          <w:rFonts w:ascii="Courier New" w:hAnsi="Courier New"/>
-          <w:sz w:val="18"/>
-        </w:rPr>
-        <w:t>key":"old_fact","value</w:t>
-      </w:r>
-      <w:proofErr w:type="spellEnd"/>
-      <w:r>
-        <w:rPr>
-          <w:rFonts w:ascii="Courier New" w:hAnsi="Courier New"/>
-          <w:sz w:val="18"/>
-        </w:rPr>
-        <w:t>":""}</w:t>
+        <w:t>"key":"old_fact","value":""}</w:t>
       </w:r>
     </w:p>
     <w:p>
@@ -5239,87 +4359,7 @@
           <w:rFonts w:ascii="Courier New" w:hAnsi="Courier New"/>
           <w:sz w:val="18"/>
         </w:rPr>
-        <w:t xml:space="preserve">Dangerous = true for: rm, </w:t>
-      </w:r>
-      <w:proofErr w:type="spellStart"/>
-      <w:r>
-        <w:rPr>
-          <w:rFonts w:ascii="Courier New" w:hAnsi="Courier New"/>
-          <w:sz w:val="18"/>
-        </w:rPr>
-        <w:t>rmdir</w:t>
-      </w:r>
-      <w:proofErr w:type="spellEnd"/>
-      <w:r>
-        <w:rPr>
-          <w:rFonts w:ascii="Courier New" w:hAnsi="Courier New"/>
-          <w:sz w:val="18"/>
-        </w:rPr>
-        <w:t xml:space="preserve">, mv, cp (overwrite), </w:t>
-      </w:r>
-      <w:proofErr w:type="spellStart"/>
-      <w:r>
-        <w:rPr>
-          <w:rFonts w:ascii="Courier New" w:hAnsi="Courier New"/>
-          <w:sz w:val="18"/>
-        </w:rPr>
-        <w:t>chmod</w:t>
-      </w:r>
-      <w:proofErr w:type="spellEnd"/>
-      <w:r>
-        <w:rPr>
-          <w:rFonts w:ascii="Courier New" w:hAnsi="Courier New"/>
-          <w:sz w:val="18"/>
-        </w:rPr>
-        <w:t xml:space="preserve">, </w:t>
-      </w:r>
-      <w:proofErr w:type="spellStart"/>
-      <w:r>
-        <w:rPr>
-          <w:rFonts w:ascii="Courier New" w:hAnsi="Courier New"/>
-          <w:sz w:val="18"/>
-        </w:rPr>
-        <w:t>chown</w:t>
-      </w:r>
-      <w:proofErr w:type="spellEnd"/>
-      <w:r>
-        <w:rPr>
-          <w:rFonts w:ascii="Courier New" w:hAnsi="Courier New"/>
-          <w:sz w:val="18"/>
-        </w:rPr>
-        <w:t xml:space="preserve">, kill, </w:t>
-      </w:r>
-      <w:proofErr w:type="spellStart"/>
-      <w:r>
-        <w:rPr>
-          <w:rFonts w:ascii="Courier New" w:hAnsi="Courier New"/>
-          <w:sz w:val="18"/>
-        </w:rPr>
-        <w:t>pkill</w:t>
-      </w:r>
-      <w:proofErr w:type="spellEnd"/>
-      <w:r>
-        <w:rPr>
-          <w:rFonts w:ascii="Courier New" w:hAnsi="Courier New"/>
-          <w:sz w:val="18"/>
-        </w:rPr>
-        <w:t xml:space="preserve">, </w:t>
-      </w:r>
-      <w:proofErr w:type="spellStart"/>
-      <w:r>
-        <w:rPr>
-          <w:rFonts w:ascii="Courier New" w:hAnsi="Courier New"/>
-          <w:sz w:val="18"/>
-        </w:rPr>
-        <w:t>sudo</w:t>
-      </w:r>
-      <w:proofErr w:type="spellEnd"/>
-      <w:r>
-        <w:rPr>
-          <w:rFonts w:ascii="Courier New" w:hAnsi="Courier New"/>
-          <w:sz w:val="18"/>
-        </w:rPr>
-        <w:t>,</w:t>
+        <w:t>Dangerous = true for: rm, rmdir, mv, cp (overwrite), chmod, chown, kill, pkill, sudo,</w:t>
       </w:r>
     </w:p>
     <w:p>
@@ -5332,39 +4372,7 @@
           <w:rFonts w:ascii="Courier New" w:hAnsi="Courier New"/>
           <w:sz w:val="18"/>
         </w:rPr>
-        <w:t xml:space="preserve">apt/pip/brew, git push/reset --hard, </w:t>
-      </w:r>
-      <w:proofErr w:type="spellStart"/>
-      <w:r>
-        <w:rPr>
-          <w:rFonts w:ascii="Courier New" w:hAnsi="Courier New"/>
-          <w:sz w:val="18"/>
-        </w:rPr>
-        <w:t>curl|sh</w:t>
-      </w:r>
-      <w:proofErr w:type="spellEnd"/>
-      <w:r>
-        <w:rPr>
-          <w:rFonts w:ascii="Courier New" w:hAnsi="Courier New"/>
-          <w:sz w:val="18"/>
-        </w:rPr>
-        <w:t xml:space="preserve">, dd, </w:t>
-      </w:r>
-      <w:proofErr w:type="spellStart"/>
-      <w:r>
-        <w:rPr>
-          <w:rFonts w:ascii="Courier New" w:hAnsi="Courier New"/>
-          <w:sz w:val="18"/>
-        </w:rPr>
-        <w:t>mkfs</w:t>
-      </w:r>
-      <w:proofErr w:type="spellEnd"/>
-      <w:r>
-        <w:rPr>
-          <w:rFonts w:ascii="Courier New" w:hAnsi="Courier New"/>
-          <w:sz w:val="18"/>
-        </w:rPr>
-        <w:t>, truncate, &gt; redirects,</w:t>
+        <w:t>apt/pip/brew, git push/reset --hard, curl|sh, dd, mkfs, truncate, &gt; redirects,</w:t>
       </w:r>
     </w:p>
     <w:p>
@@ -5372,21 +4380,12 @@
         <w:pStyle w:val="NoSpacing"/>
         <w:shd w:val="clear" w:color="auto" w:fill="F0F0F0"/>
       </w:pPr>
-      <w:proofErr w:type="spellStart"/>
-      <w:r>
-        <w:rPr>
-          <w:rFonts w:ascii="Courier New" w:hAnsi="Courier New"/>
-          <w:sz w:val="18"/>
-        </w:rPr>
-        <w:t>systemctl</w:t>
-      </w:r>
-      <w:proofErr w:type="spellEnd"/>
-      <w:r>
-        <w:rPr>
-          <w:rFonts w:ascii="Courier New" w:hAnsi="Courier New"/>
-          <w:sz w:val="18"/>
-        </w:rPr>
-        <w:t xml:space="preserve"> stop/disable, and anything else that alters state.</w:t>
+      <w:r>
+        <w:rPr>
+          <w:rFonts w:ascii="Courier New" w:hAnsi="Courier New"/>
+          <w:sz w:val="18"/>
+        </w:rPr>
+        <w:t>systemctl stop/disable, and anything else that alters state.</w:t>
       </w:r>
     </w:p>
     <w:p>
@@ -5412,55 +4411,7 @@
           <w:rFonts w:ascii="Courier New" w:hAnsi="Courier New"/>
           <w:sz w:val="18"/>
         </w:rPr>
-        <w:t xml:space="preserve">Dangerous = false for: ls, cat, head, tail, grep, find, </w:t>
-      </w:r>
-      <w:proofErr w:type="spellStart"/>
-      <w:r>
-        <w:rPr>
-          <w:rFonts w:ascii="Courier New" w:hAnsi="Courier New"/>
-          <w:sz w:val="18"/>
-        </w:rPr>
-        <w:t>ps</w:t>
-      </w:r>
-      <w:proofErr w:type="spellEnd"/>
-      <w:r>
-        <w:rPr>
-          <w:rFonts w:ascii="Courier New" w:hAnsi="Courier New"/>
-          <w:sz w:val="18"/>
-        </w:rPr>
-        <w:t xml:space="preserve">, </w:t>
-      </w:r>
-      <w:proofErr w:type="spellStart"/>
-      <w:r>
-        <w:rPr>
-          <w:rFonts w:ascii="Courier New" w:hAnsi="Courier New"/>
-          <w:sz w:val="18"/>
-        </w:rPr>
-        <w:t>df</w:t>
-      </w:r>
-      <w:proofErr w:type="spellEnd"/>
-      <w:r>
-        <w:rPr>
-          <w:rFonts w:ascii="Courier New" w:hAnsi="Courier New"/>
-          <w:sz w:val="18"/>
-        </w:rPr>
-        <w:t xml:space="preserve">, du, </w:t>
-      </w:r>
-      <w:proofErr w:type="spellStart"/>
-      <w:r>
-        <w:rPr>
-          <w:rFonts w:ascii="Courier New" w:hAnsi="Courier New"/>
-          <w:sz w:val="18"/>
-        </w:rPr>
-        <w:t>pwd</w:t>
-      </w:r>
-      <w:proofErr w:type="spellEnd"/>
-      <w:r>
-        <w:rPr>
-          <w:rFonts w:ascii="Courier New" w:hAnsi="Courier New"/>
-          <w:sz w:val="18"/>
-        </w:rPr>
-        <w:t>, echo,</w:t>
+        <w:t>Dangerous = false for: ls, cat, head, tail, grep, find, ps, df, du, pwd, echo,</w:t>
       </w:r>
     </w:p>
     <w:p>
@@ -5473,23 +4424,7 @@
           <w:rFonts w:ascii="Courier New" w:hAnsi="Courier New"/>
           <w:sz w:val="18"/>
         </w:rPr>
-        <w:t xml:space="preserve">which, man, stat, file, </w:t>
-      </w:r>
-      <w:proofErr w:type="spellStart"/>
-      <w:r>
-        <w:rPr>
-          <w:rFonts w:ascii="Courier New" w:hAnsi="Courier New"/>
-          <w:sz w:val="18"/>
-        </w:rPr>
-        <w:t>wc</w:t>
-      </w:r>
-      <w:proofErr w:type="spellEnd"/>
-      <w:r>
-        <w:rPr>
-          <w:rFonts w:ascii="Courier New" w:hAnsi="Courier New"/>
-          <w:sz w:val="18"/>
-        </w:rPr>
-        <w:t>, diff, git log/status/diff, and other read-only operations.</w:t>
+        <w:t>which, man, stat, file, wc, diff, git log/status/diff, and other read-only operations.</w:t>
       </w:r>
     </w:p>
     <w:p>
@@ -5580,22 +4515,13 @@
         </w:rPr>
         <w:t>directory: {</w:t>
       </w:r>
-      <w:proofErr w:type="spellStart"/>
       <w:proofErr w:type="gramEnd"/>
       <w:r>
         <w:rPr>
           <w:rFonts w:ascii="Courier New" w:hAnsi="Courier New"/>
           <w:sz w:val="18"/>
         </w:rPr>
-        <w:t>cwd</w:t>
-      </w:r>
-      <w:proofErr w:type="spellEnd"/>
-      <w:r>
-        <w:rPr>
-          <w:rFonts w:ascii="Courier New" w:hAnsi="Courier New"/>
-          <w:sz w:val="18"/>
-        </w:rPr>
-        <w:t>}</w:t>
+        <w:t>cwd}</w:t>
       </w:r>
     </w:p>
     <w:p>
@@ -5611,38 +4537,13 @@
         </w:rPr>
         <w:t>Shell: {</w:t>
       </w:r>
-      <w:proofErr w:type="spellStart"/>
       <w:proofErr w:type="gramEnd"/>
       <w:r>
         <w:rPr>
           <w:rFonts w:ascii="Courier New" w:hAnsi="Courier New"/>
           <w:sz w:val="18"/>
         </w:rPr>
-        <w:t>shell_name</w:t>
-      </w:r>
-      <w:proofErr w:type="spellEnd"/>
-      <w:r>
-        <w:rPr>
-          <w:rFonts w:ascii="Courier New" w:hAnsi="Courier New"/>
-          <w:sz w:val="18"/>
-        </w:rPr>
-        <w:t>}  |  Session: {</w:t>
-      </w:r>
-      <w:proofErr w:type="spellStart"/>
-      <w:r>
-        <w:rPr>
-          <w:rFonts w:ascii="Courier New" w:hAnsi="Courier New"/>
-          <w:sz w:val="18"/>
-        </w:rPr>
-        <w:t>session_id</w:t>
-      </w:r>
-      <w:proofErr w:type="spellEnd"/>
-      <w:r>
-        <w:rPr>
-          <w:rFonts w:ascii="Courier New" w:hAnsi="Courier New"/>
-          <w:sz w:val="18"/>
-        </w:rPr>
-        <w:t>}</w:t>
+        <w:t>shell_name}  |  Session: {session_id}</w:t>
       </w:r>
     </w:p>
     <w:p>
@@ -5779,23 +4680,7 @@
           <w:rFonts w:ascii="Courier New" w:hAnsi="Courier New"/>
           <w:sz w:val="18"/>
         </w:rPr>
-        <w:t xml:space="preserve">  $ {</w:t>
-      </w:r>
-      <w:proofErr w:type="spellStart"/>
-      <w:r>
-        <w:rPr>
-          <w:rFonts w:ascii="Courier New" w:hAnsi="Courier New"/>
-          <w:sz w:val="18"/>
-        </w:rPr>
-        <w:t>cmd</w:t>
-      </w:r>
-      <w:proofErr w:type="spellEnd"/>
-      <w:r>
-        <w:rPr>
-          <w:rFonts w:ascii="Courier New" w:hAnsi="Courier New"/>
-          <w:sz w:val="18"/>
-        </w:rPr>
-        <w:t>}</w:t>
+        <w:t xml:space="preserve">  $ {cmd}</w:t>
       </w:r>
     </w:p>
     <w:p>
@@ -5962,23 +4847,7 @@
           <w:rFonts w:ascii="Courier New" w:hAnsi="Courier New"/>
           <w:sz w:val="18"/>
         </w:rPr>
-        <w:t>{"</w:t>
-      </w:r>
-      <w:proofErr w:type="spellStart"/>
-      <w:r>
-        <w:rPr>
-          <w:rFonts w:ascii="Courier New" w:hAnsi="Courier New"/>
-          <w:sz w:val="18"/>
-        </w:rPr>
-        <w:t>type":"agentic_done","summary</w:t>
-      </w:r>
-      <w:proofErr w:type="spellEnd"/>
-      <w:r>
-        <w:rPr>
-          <w:rFonts w:ascii="Courier New" w:hAnsi="Courier New"/>
-          <w:sz w:val="18"/>
-        </w:rPr>
-        <w:t>":"&lt;what was accomplished</w:t>
+        <w:t>{"type":"agentic_done","summary":"&lt;what was accomplished</w:t>
       </w:r>
       <w:proofErr w:type="gramStart"/>
       <w:r>
@@ -6026,23 +4895,7 @@
           <w:rFonts w:ascii="Courier New" w:hAnsi="Courier New"/>
           <w:sz w:val="18"/>
         </w:rPr>
-        <w:t>{"</w:t>
-      </w:r>
-      <w:proofErr w:type="spellStart"/>
-      <w:r>
-        <w:rPr>
-          <w:rFonts w:ascii="Courier New" w:hAnsi="Courier New"/>
-          <w:sz w:val="18"/>
-        </w:rPr>
-        <w:t>type":"agentic_ask","question</w:t>
-      </w:r>
-      <w:proofErr w:type="spellEnd"/>
-      <w:r>
-        <w:rPr>
-          <w:rFonts w:ascii="Courier New" w:hAnsi="Courier New"/>
-          <w:sz w:val="18"/>
-        </w:rPr>
-        <w:t>":"&lt;your question</w:t>
+        <w:t>{"type":"agentic_ask","question":"&lt;your question</w:t>
       </w:r>
       <w:proofErr w:type="gramStart"/>
       <w:r>
@@ -6090,23 +4943,7 @@
           <w:rFonts w:ascii="Courier New" w:hAnsi="Courier New"/>
           <w:sz w:val="18"/>
         </w:rPr>
-        <w:t xml:space="preserve">Never loop forever: if you cannot make progress after 3 attempts, use </w:t>
-      </w:r>
-      <w:proofErr w:type="spellStart"/>
-      <w:r>
-        <w:rPr>
-          <w:rFonts w:ascii="Courier New" w:hAnsi="Courier New"/>
-          <w:sz w:val="18"/>
-        </w:rPr>
-        <w:t>agentic_done</w:t>
-      </w:r>
-      <w:proofErr w:type="spellEnd"/>
-      <w:r>
-        <w:rPr>
-          <w:rFonts w:ascii="Courier New" w:hAnsi="Courier New"/>
-          <w:sz w:val="18"/>
-        </w:rPr>
-        <w:t xml:space="preserve"> to stop.</w:t>
+        <w:t>Never loop forever: if you cannot make progress after 3 attempts, use agentic_done to stop.</w:t>
       </w:r>
     </w:p>
     <w:p>
@@ -6142,22 +4979,13 @@
         </w:rPr>
         <w:t>directory: {</w:t>
       </w:r>
-      <w:proofErr w:type="spellStart"/>
       <w:proofErr w:type="gramEnd"/>
       <w:r>
         <w:rPr>
           <w:rFonts w:ascii="Courier New" w:hAnsi="Courier New"/>
           <w:sz w:val="18"/>
         </w:rPr>
-        <w:t>cwd</w:t>
-      </w:r>
-      <w:proofErr w:type="spellEnd"/>
-      <w:r>
-        <w:rPr>
-          <w:rFonts w:ascii="Courier New" w:hAnsi="Courier New"/>
-          <w:sz w:val="18"/>
-        </w:rPr>
-        <w:t>}</w:t>
+        <w:t>cwd}</w:t>
       </w:r>
     </w:p>
     <w:p>
@@ -6170,23 +4998,7 @@
           <w:rFonts w:ascii="Courier New" w:hAnsi="Courier New"/>
           <w:sz w:val="18"/>
         </w:rPr>
-        <w:t>Shell: {</w:t>
-      </w:r>
-      <w:proofErr w:type="spellStart"/>
-      <w:r>
-        <w:rPr>
-          <w:rFonts w:ascii="Courier New" w:hAnsi="Courier New"/>
-          <w:sz w:val="18"/>
-        </w:rPr>
-        <w:t>shell_name</w:t>
-      </w:r>
-      <w:proofErr w:type="spellEnd"/>
-      <w:r>
-        <w:rPr>
-          <w:rFonts w:ascii="Courier New" w:hAnsi="Courier New"/>
-          <w:sz w:val="18"/>
-        </w:rPr>
-        <w:t>}</w:t>
+        <w:t>Shell: {shell_name}</w:t>
       </w:r>
     </w:p>
     <w:p>
@@ -6438,7 +5250,7 @@
   <w:abstractNum w:abstractNumId="8" w15:restartNumberingAfterBreak="0">
     <w:nsid w:val="FFFFFF89"/>
     <w:multiLevelType w:val="singleLevel"/>
-    <w:tmpl w:val="4E1CDDBA"/>
+    <w:tmpl w:val="624C7C70"/>
     <w:lvl w:ilvl="0">
       <w:start w:val="1"/>
       <w:numFmt w:val="bullet"/>

</xml_diff>